<commit_message>
Sprint 1 plan: one complete user story per task
Co-Authored-By: Claude Opus 5.5 <noreply@anthropic.com>
Claude-Session: https://claude.ai/code/session_014Xczj9BvceXEqxvt3pSPtj
</commit_message>
<xml_diff>
--- a/docs/sprints/Sprint1_Plan.docx
+++ b/docs/sprints/Sprint1_Plan.docx
@@ -634,10 +634,10 @@
         </w:tblBorders>
       </w:tblPr>
       <w:tblGrid>
-        <w:gridCol w:w="1800"/>
-        <w:gridCol w:w="3400"/>
-        <w:gridCol w:w="6078"/>
-        <w:gridCol w:w="2200"/>
+        <w:gridCol w:w="1700"/>
+        <w:gridCol w:w="3000"/>
+        <w:gridCol w:w="4978"/>
+        <w:gridCol w:w="3800"/>
         <w:gridCol w:w="1200"/>
       </w:tblGrid>
       <w:tr>
@@ -646,7 +646,7 @@
         </w:trPr>
         <w:tc>
           <w:tcPr>
-            <w:tcW w:type="dxa" w:w="1800"/>
+            <w:tcW w:type="dxa" w:w="1700"/>
             <w:tcBorders>
               <w:top w:val="single" w:color="BFBFBF" w:sz="4"/>
               <w:left w:val="single" w:color="BFBFBF" w:sz="4"/>
@@ -678,7 +678,7 @@
         </w:tc>
         <w:tc>
           <w:tcPr>
-            <w:tcW w:type="dxa" w:w="3400"/>
+            <w:tcW w:type="dxa" w:w="3000"/>
             <w:tcBorders>
               <w:top w:val="single" w:color="BFBFBF" w:sz="4"/>
               <w:left w:val="single" w:color="BFBFBF" w:sz="4"/>
@@ -710,7 +710,7 @@
         </w:tc>
         <w:tc>
           <w:tcPr>
-            <w:tcW w:type="dxa" w:w="6078"/>
+            <w:tcW w:type="dxa" w:w="4978"/>
             <w:tcBorders>
               <w:top w:val="single" w:color="BFBFBF" w:sz="4"/>
               <w:left w:val="single" w:color="BFBFBF" w:sz="4"/>
@@ -742,7 +742,7 @@
         </w:tc>
         <w:tc>
           <w:tcPr>
-            <w:tcW w:type="dxa" w:w="2200"/>
+            <w:tcW w:type="dxa" w:w="3800"/>
             <w:tcBorders>
               <w:top w:val="single" w:color="BFBFBF" w:sz="4"/>
               <w:left w:val="single" w:color="BFBFBF" w:sz="4"/>
@@ -800,7 +800,7 @@
                 <w:sz w:val="19"/>
                 <w:szCs w:val="19"/>
               </w:rPr>
-              <w:t xml:space="preserve">Points</w:t>
+              <w:t xml:space="preserve">Stories</w:t>
             </w:r>
           </w:p>
         </w:tc>
@@ -808,7 +808,7 @@
       <w:tr>
         <w:tc>
           <w:tcPr>
-            <w:tcW w:type="dxa" w:w="1800"/>
+            <w:tcW w:type="dxa" w:w="1700"/>
             <w:tcBorders>
               <w:top w:val="single" w:color="BFBFBF" w:sz="4"/>
               <w:left w:val="single" w:color="BFBFBF" w:sz="4"/>
@@ -838,7 +838,7 @@
         </w:tc>
         <w:tc>
           <w:tcPr>
-            <w:tcW w:type="dxa" w:w="3400"/>
+            <w:tcW w:type="dxa" w:w="3000"/>
             <w:tcBorders>
               <w:top w:val="single" w:color="BFBFBF" w:sz="4"/>
               <w:left w:val="single" w:color="BFBFBF" w:sz="4"/>
@@ -868,7 +868,7 @@
         </w:tc>
         <w:tc>
           <w:tcPr>
-            <w:tcW w:type="dxa" w:w="6078"/>
+            <w:tcW w:type="dxa" w:w="4978"/>
             <w:tcBorders>
               <w:top w:val="single" w:color="BFBFBF" w:sz="4"/>
               <w:left w:val="single" w:color="BFBFBF" w:sz="4"/>
@@ -892,13 +892,13 @@
                 <w:sz w:val="20"/>
                 <w:szCs w:val="20"/>
               </w:rPr>
-              <w:t xml:space="preserve">Repo and auto-deploy, Supabase database, login with roles, architecture document</w:t>
-            </w:r>
-          </w:p>
-        </w:tc>
-        <w:tc>
-          <w:tcPr>
-            <w:tcW w:type="dxa" w:w="2200"/>
+              <w:t xml:space="preserve">Supabase database, project setup, sign-in and privacy, architecture document</w:t>
+            </w:r>
+          </w:p>
+        </w:tc>
+        <w:tc>
+          <w:tcPr>
+            <w:tcW w:type="dxa" w:w="3800"/>
             <w:tcBorders>
               <w:top w:val="single" w:color="BFBFBF" w:sz="4"/>
               <w:left w:val="single" w:color="BFBFBF" w:sz="4"/>
@@ -922,7 +922,7 @@
                 <w:sz w:val="20"/>
                 <w:szCs w:val="20"/>
               </w:rPr>
-              <w:t xml:space="preserve">S1-01 to S1-04</w:t>
+              <w:t xml:space="preserve">S1-01, S1-05, S1-09, S1-15, S1-20, S1-24</w:t>
             </w:r>
           </w:p>
         </w:tc>
@@ -955,7 +955,7 @@
                 <w:sz w:val="20"/>
                 <w:szCs w:val="20"/>
               </w:rPr>
-              <w:t xml:space="preserve">16</w:t>
+              <w:t xml:space="preserve">6</w:t>
             </w:r>
           </w:p>
         </w:tc>
@@ -963,7 +963,7 @@
       <w:tr>
         <w:tc>
           <w:tcPr>
-            <w:tcW w:type="dxa" w:w="1800"/>
+            <w:tcW w:type="dxa" w:w="1700"/>
             <w:tcBorders>
               <w:top w:val="single" w:color="BFBFBF" w:sz="4"/>
               <w:left w:val="single" w:color="BFBFBF" w:sz="4"/>
@@ -993,7 +993,7 @@
         </w:tc>
         <w:tc>
           <w:tcPr>
-            <w:tcW w:type="dxa" w:w="3400"/>
+            <w:tcW w:type="dxa" w:w="3000"/>
             <w:tcBorders>
               <w:top w:val="single" w:color="BFBFBF" w:sz="4"/>
               <w:left w:val="single" w:color="BFBFBF" w:sz="4"/>
@@ -1023,7 +1023,7 @@
         </w:tc>
         <w:tc>
           <w:tcPr>
-            <w:tcW w:type="dxa" w:w="6078"/>
+            <w:tcW w:type="dxa" w:w="4978"/>
             <w:tcBorders>
               <w:top w:val="single" w:color="BFBFBF" w:sz="4"/>
               <w:left w:val="single" w:color="BFBFBF" w:sz="4"/>
@@ -1047,13 +1047,13 @@
                 <w:sz w:val="20"/>
                 <w:szCs w:val="20"/>
               </w:rPr>
-              <w:t xml:space="preserve">Kopano Freight dataset, trained classifier, classify API, low-confidence flagging, historical data</w:t>
-            </w:r>
-          </w:p>
-        </w:tc>
-        <w:tc>
-          <w:tcPr>
-            <w:tcW w:type="dxa" w:w="2200"/>
+              <w:t xml:space="preserve">Ticket dataset, trained classifier, automatic routing, low-confidence flagging, historical data</w:t>
+            </w:r>
+          </w:p>
+        </w:tc>
+        <w:tc>
+          <w:tcPr>
+            <w:tcW w:type="dxa" w:w="3800"/>
             <w:tcBorders>
               <w:top w:val="single" w:color="BFBFBF" w:sz="4"/>
               <w:left w:val="single" w:color="BFBFBF" w:sz="4"/>
@@ -1077,7 +1077,7 @@
                 <w:sz w:val="20"/>
                 <w:szCs w:val="20"/>
               </w:rPr>
-              <w:t xml:space="preserve">S1-05 to S1-09</w:t>
+              <w:t xml:space="preserve">S1-02, S1-06, S1-10, S1-16, S1-17, S1-21, S1-25</w:t>
             </w:r>
           </w:p>
         </w:tc>
@@ -1110,7 +1110,7 @@
                 <w:sz w:val="20"/>
                 <w:szCs w:val="20"/>
               </w:rPr>
-              <w:t xml:space="preserve">20</w:t>
+              <w:t xml:space="preserve">7</w:t>
             </w:r>
           </w:p>
         </w:tc>
@@ -1118,7 +1118,7 @@
       <w:tr>
         <w:tc>
           <w:tcPr>
-            <w:tcW w:type="dxa" w:w="1800"/>
+            <w:tcW w:type="dxa" w:w="1700"/>
             <w:tcBorders>
               <w:top w:val="single" w:color="BFBFBF" w:sz="4"/>
               <w:left w:val="single" w:color="BFBFBF" w:sz="4"/>
@@ -1148,7 +1148,7 @@
         </w:tc>
         <w:tc>
           <w:tcPr>
-            <w:tcW w:type="dxa" w:w="3400"/>
+            <w:tcW w:type="dxa" w:w="3000"/>
             <w:tcBorders>
               <w:top w:val="single" w:color="BFBFBF" w:sz="4"/>
               <w:left w:val="single" w:color="BFBFBF" w:sz="4"/>
@@ -1178,7 +1178,7 @@
         </w:tc>
         <w:tc>
           <w:tcPr>
-            <w:tcW w:type="dxa" w:w="6078"/>
+            <w:tcW w:type="dxa" w:w="4978"/>
             <w:tcBorders>
               <w:top w:val="single" w:color="BFBFBF" w:sz="4"/>
               <w:left w:val="single" w:color="BFBFBF" w:sz="4"/>
@@ -1202,13 +1202,13 @@
                 <w:sz w:val="20"/>
                 <w:szCs w:val="20"/>
               </w:rPr>
-              <w:t xml:space="preserve">Personas, wireframes, design system, submit form, My requests</w:t>
-            </w:r>
-          </w:p>
-        </w:tc>
-        <w:tc>
-          <w:tcPr>
-            <w:tcW w:type="dxa" w:w="2200"/>
+              <w:t xml:space="preserve">Personas, wireframes, design system, role menu, submit form, My requests</w:t>
+            </w:r>
+          </w:p>
+        </w:tc>
+        <w:tc>
+          <w:tcPr>
+            <w:tcW w:type="dxa" w:w="3800"/>
             <w:tcBorders>
               <w:top w:val="single" w:color="BFBFBF" w:sz="4"/>
               <w:left w:val="single" w:color="BFBFBF" w:sz="4"/>
@@ -1232,7 +1232,7 @@
                 <w:sz w:val="20"/>
                 <w:szCs w:val="20"/>
               </w:rPr>
-              <w:t xml:space="preserve">S1-10 to S1-13</w:t>
+              <w:t xml:space="preserve">S1-03, S1-07, S1-11, S1-12, S1-18, S1-22, S1-26</w:t>
             </w:r>
           </w:p>
         </w:tc>
@@ -1265,7 +1265,7 @@
                 <w:sz w:val="20"/>
                 <w:szCs w:val="20"/>
               </w:rPr>
-              <w:t xml:space="preserve">16</w:t>
+              <w:t xml:space="preserve">7</w:t>
             </w:r>
           </w:p>
         </w:tc>
@@ -1273,7 +1273,7 @@
       <w:tr>
         <w:tc>
           <w:tcPr>
-            <w:tcW w:type="dxa" w:w="1800"/>
+            <w:tcW w:type="dxa" w:w="1700"/>
             <w:tcBorders>
               <w:top w:val="single" w:color="BFBFBF" w:sz="4"/>
               <w:left w:val="single" w:color="BFBFBF" w:sz="4"/>
@@ -1303,7 +1303,7 @@
         </w:tc>
         <w:tc>
           <w:tcPr>
-            <w:tcW w:type="dxa" w:w="3400"/>
+            <w:tcW w:type="dxa" w:w="3000"/>
             <w:tcBorders>
               <w:top w:val="single" w:color="BFBFBF" w:sz="4"/>
               <w:left w:val="single" w:color="BFBFBF" w:sz="4"/>
@@ -1333,7 +1333,7 @@
         </w:tc>
         <w:tc>
           <w:tcPr>
-            <w:tcW w:type="dxa" w:w="6078"/>
+            <w:tcW w:type="dxa" w:w="4978"/>
             <w:tcBorders>
               <w:top w:val="single" w:color="BFBFBF" w:sz="4"/>
               <w:left w:val="single" w:color="BFBFBF" w:sz="4"/>
@@ -1357,13 +1357,13 @@
                 <w:sz w:val="20"/>
                 <w:szCs w:val="20"/>
               </w:rPr>
-              <w:t xml:space="preserve">Gemini drafts, templates, tone control, agent inbox, review and send</w:t>
-            </w:r>
-          </w:p>
-        </w:tc>
-        <w:tc>
-          <w:tcPr>
-            <w:tcW w:type="dxa" w:w="2200"/>
+              <w:t xml:space="preserve">Reply templates, AI drafts, tone control, agent inbox, edit and send, template library</w:t>
+            </w:r>
+          </w:p>
+        </w:tc>
+        <w:tc>
+          <w:tcPr>
+            <w:tcW w:type="dxa" w:w="3800"/>
             <w:tcBorders>
               <w:top w:val="single" w:color="BFBFBF" w:sz="4"/>
               <w:left w:val="single" w:color="BFBFBF" w:sz="4"/>
@@ -1387,7 +1387,7 @@
                 <w:sz w:val="20"/>
                 <w:szCs w:val="20"/>
               </w:rPr>
-              <w:t xml:space="preserve">S1-14 to S1-18</w:t>
+              <w:t xml:space="preserve">S1-04, S1-08, S1-13, S1-14, S1-19, S1-23, S1-27, S1-28</w:t>
             </w:r>
           </w:p>
         </w:tc>
@@ -1420,7 +1420,7 @@
                 <w:sz w:val="20"/>
                 <w:szCs w:val="20"/>
               </w:rPr>
-              <w:t xml:space="preserve">21</w:t>
+              <w:t xml:space="preserve">8</w:t>
             </w:r>
           </w:p>
         </w:tc>
@@ -1602,7 +1602,7 @@
                 <w:sz w:val="19"/>
                 <w:szCs w:val="19"/>
               </w:rPr>
-              <w:t xml:space="preserve">Task (user story)</w:t>
+              <w:t xml:space="preserve">User story</w:t>
             </w:r>
           </w:p>
         </w:tc>
@@ -1764,7 +1764,7 @@
                 <w:sz w:val="19"/>
                 <w:szCs w:val="19"/>
               </w:rPr>
-              <w:t xml:space="preserve">Project planning</w:t>
+              <w:t xml:space="preserve">As the team, I want an agreed project idea and roadmap, so that everyone works towards the same product.</w:t>
             </w:r>
           </w:p>
         </w:tc>
@@ -1925,7 +1925,7 @@
                 <w:sz w:val="19"/>
                 <w:szCs w:val="19"/>
               </w:rPr>
-              <w:t xml:space="preserve">Sprint planning</w:t>
+              <w:t xml:space="preserve">As the team, I want the sprint planned and our tools set up, so that everyone knows what to build and where.</w:t>
             </w:r>
           </w:p>
         </w:tc>
@@ -1956,7 +1956,7 @@
                 <w:sz w:val="19"/>
                 <w:szCs w:val="19"/>
               </w:rPr>
-              <w:t xml:space="preserve">Sprint 1 features and user stories written; owners assigned; GitHub repo created; Vercel connected and live</w:t>
+              <w:t xml:space="preserve">Sprint 1 user stories written; owners assigned; GitHub repo created; Vercel connected and live</w:t>
             </w:r>
           </w:p>
         </w:tc>
@@ -2086,7 +2086,7 @@
                 <w:sz w:val="19"/>
                 <w:szCs w:val="19"/>
               </w:rPr>
-              <w:t xml:space="preserve">S1-02 · As a team member, I want the database designed for all eight weeks, so that later modules don't need rework.</w:t>
+              <w:t xml:space="preserve">S1-01 · As a developer, I want the database tables set up in Supabase, so that the team has one place to store tickets, classifications and replies.</w:t>
             </w:r>
           </w:p>
         </w:tc>
@@ -2116,7 +2116,7 @@
                 <w:sz w:val="19"/>
                 <w:szCs w:val="19"/>
               </w:rPr>
-              <w:t xml:space="preserve">Supabase project created; migration 0001 run; tickets, classifications, responses, templates and audit_log tables exist; all four ticket timestamps present; row-level security on</w:t>
+              <w:t xml:space="preserve">Supabase project created; migration 0001 run; tickets, classifications, responses, templates and audit_log tables exist; each ticket has created, assigned, answered and closed times; row-level security switched on</w:t>
             </w:r>
           </w:p>
         </w:tc>
@@ -2223,19 +2223,7 @@
                 <w:sz w:val="19"/>
                 <w:szCs w:val="19"/>
               </w:rPr>
-              <w:t xml:space="preserve">S1-05 · As the team, I want a realistic ticket dataset, so that we can train the classifier and power later dashboards. </w:t>
-            </w:r>
-            <w:r>
-              <w:rPr>
-                <w:rFonts w:ascii="Calibri" w:cs="Calibri" w:eastAsia="Calibri" w:hAnsi="Calibri"/>
-                <w:b w:val="false"/>
-                <w:bCs w:val="false"/>
-                <w:i/>
-                <w:iCs/>
-                <w:sz w:val="19"/>
-                <w:szCs w:val="19"/>
-              </w:rPr>
-              <w:t xml:space="preserve">(part 1)</w:t>
+              <w:t xml:space="preserve">S1-02 · As the data developer, I want real IT support tickets downloaded and sorted into our four departments, so that the classifier learns from real examples.</w:t>
             </w:r>
           </w:p>
         </w:tc>
@@ -2265,7 +2253,7 @@
                 <w:sz w:val="19"/>
                 <w:szCs w:val="19"/>
               </w:rPr>
-              <w:t xml:space="preserve">Kaggle IT ticket dataset downloaded into data/raw; its categories mapped to HR, IT, Finance and Operations</w:t>
+              <w:t xml:space="preserve">Kaggle IT ticket dataset saved in data/raw; its categories mapped to HR, IT, Finance and Operations</w:t>
             </w:r>
           </w:p>
         </w:tc>
@@ -2372,19 +2360,7 @@
                 <w:sz w:val="19"/>
                 <w:szCs w:val="19"/>
               </w:rPr>
-              <w:t xml:space="preserve">S1-10 · As the team, I want personas and wireframes agreed early, so that everyone builds screens that fit together. </w:t>
-            </w:r>
-            <w:r>
-              <w:rPr>
-                <w:rFonts w:ascii="Calibri" w:cs="Calibri" w:eastAsia="Calibri" w:hAnsi="Calibri"/>
-                <w:b w:val="false"/>
-                <w:bCs w:val="false"/>
-                <w:i/>
-                <w:iCs/>
-                <w:sz w:val="19"/>
-                <w:szCs w:val="19"/>
-              </w:rPr>
-              <w:t xml:space="preserve">(part 1)</w:t>
+              <w:t xml:space="preserve">S1-03 · As the designer, I want a persona for each user role and a journey map, so that the team designs screens around real needs.</w:t>
             </w:r>
           </w:p>
         </w:tc>
@@ -2414,7 +2390,7 @@
                 <w:sz w:val="19"/>
                 <w:szCs w:val="19"/>
               </w:rPr>
-              <w:t xml:space="preserve">One persona per role (staff, agent, manager, compliance); one journey map from problem to resolution</w:t>
+              <w:t xml:space="preserve">One persona each for staff, agent, manager and compliance; one journey map from problem to resolution</w:t>
             </w:r>
           </w:p>
         </w:tc>
@@ -2521,19 +2497,7 @@
                 <w:sz w:val="19"/>
                 <w:szCs w:val="19"/>
               </w:rPr>
-              <w:t xml:space="preserve">S1-15 · As an agent, I want professional templates for each department, so that replies are consistent. </w:t>
-            </w:r>
-            <w:r>
-              <w:rPr>
-                <w:rFonts w:ascii="Calibri" w:cs="Calibri" w:eastAsia="Calibri" w:hAnsi="Calibri"/>
-                <w:b w:val="false"/>
-                <w:bCs w:val="false"/>
-                <w:i/>
-                <w:iCs/>
-                <w:sz w:val="19"/>
-                <w:szCs w:val="19"/>
-              </w:rPr>
-              <w:t xml:space="preserve">(part 1)</w:t>
+              <w:t xml:space="preserve">S1-04 · As an agent, I want ready-made reply templates for each department, so that every reply starts from approved wording.</w:t>
             </w:r>
           </w:p>
         </w:tc>
@@ -2563,7 +2527,7 @@
                 <w:sz w:val="19"/>
                 <w:szCs w:val="19"/>
               </w:rPr>
-              <w:t xml:space="preserve">At least three templates per department written; Gemini API key created and shared securely with the team</w:t>
+              <w:t xml:space="preserve">At least three templates per department written; Gemini API key created and kept out of the code</w:t>
             </w:r>
           </w:p>
         </w:tc>
@@ -2695,7 +2659,7 @@
                 <w:sz w:val="19"/>
                 <w:szCs w:val="19"/>
               </w:rPr>
-              <w:t xml:space="preserve">S1-01 · As a team member, I want a shared repo that deploys automatically, so that everyone builds on the same live app.</w:t>
+              <w:t xml:space="preserve">S1-05 · As a developer, I want the project running on my own computer with its keys set up, so that I can build and test my feature.</w:t>
             </w:r>
           </w:p>
         </w:tc>
@@ -2726,7 +2690,7 @@
                 <w:sz w:val="19"/>
                 <w:szCs w:val="19"/>
               </w:rPr>
-              <w:t xml:space="preserve">Supabase and Gemini keys added to Vercel; all four members clone the repo and run the app locally; branch rule on main switched on</w:t>
+              <w:t xml:space="preserve">Supabase and Gemini keys added to Vercel; all four members clone the repo and run the app locally; rule on main switched on so changes need a reviewed pull request</w:t>
             </w:r>
           </w:p>
         </w:tc>
@@ -2836,19 +2800,7 @@
                 <w:sz w:val="19"/>
                 <w:szCs w:val="19"/>
               </w:rPr>
-              <w:t xml:space="preserve">S1-05 · Realistic ticket dataset </w:t>
-            </w:r>
-            <w:r>
-              <w:rPr>
-                <w:rFonts w:ascii="Calibri" w:cs="Calibri" w:eastAsia="Calibri" w:hAnsi="Calibri"/>
-                <w:b w:val="false"/>
-                <w:bCs w:val="false"/>
-                <w:i/>
-                <w:iCs/>
-                <w:sz w:val="19"/>
-                <w:szCs w:val="19"/>
-              </w:rPr>
-              <w:t xml:space="preserve">(part 2)</w:t>
+              <w:t xml:space="preserve">S1-06 · As the data developer, I want HR, Finance and Operations tickets written for Kopano Freight, so that every department has enough examples to train on.</w:t>
             </w:r>
           </w:p>
         </w:tc>
@@ -2879,7 +2831,7 @@
                 <w:sz w:val="19"/>
                 <w:szCs w:val="19"/>
               </w:rPr>
-              <w:t xml:space="preserve">Synthetic HR, Finance and Operations tickets written; every ticket has a 12-month timestamp, depot and priority; categories reasonably balanced; CSV and data dictionary saved</w:t>
+              <w:t xml:space="preserve">Synthetic HR, Finance and Operations tickets written; every ticket has a date within the last 12 months, a depot and a priority; departments reasonably balanced; CSV and data dictionary saved</w:t>
             </w:r>
           </w:p>
         </w:tc>
@@ -2989,19 +2941,7 @@
                 <w:sz w:val="19"/>
                 <w:szCs w:val="19"/>
               </w:rPr>
-              <w:t xml:space="preserve">S1-10 · Personas and wireframes </w:t>
-            </w:r>
-            <w:r>
-              <w:rPr>
-                <w:rFonts w:ascii="Calibri" w:cs="Calibri" w:eastAsia="Calibri" w:hAnsi="Calibri"/>
-                <w:b w:val="false"/>
-                <w:bCs w:val="false"/>
-                <w:i/>
-                <w:iCs/>
-                <w:sz w:val="19"/>
-                <w:szCs w:val="19"/>
-              </w:rPr>
-              <w:t xml:space="preserve">(part 2)</w:t>
+              <w:t xml:space="preserve">S1-07 · As a developer, I want wireframes of every Sprint 1 screen, so that I know what each page should contain before I build it.</w:t>
             </w:r>
           </w:p>
         </w:tc>
@@ -3032,7 +2972,7 @@
                 <w:sz w:val="19"/>
                 <w:szCs w:val="19"/>
               </w:rPr>
-              <w:t xml:space="preserve">Low-fidelity wireframes for all Sprint 1 screens: login, submit request, My requests, request detail, agent inbox, ticket view, template library</w:t>
+              <w:t xml:space="preserve">Low-fidelity wireframes for login, submit request, My requests, request detail, agent inbox, ticket view and template library</w:t>
             </w:r>
           </w:p>
         </w:tc>
@@ -3142,19 +3082,7 @@
                 <w:sz w:val="19"/>
                 <w:szCs w:val="19"/>
               </w:rPr>
-              <w:t xml:space="preserve">S1-14 · As an agent, I want a reply drafted by AI when a ticket arrives, so that I can respond faster. </w:t>
-            </w:r>
-            <w:r>
-              <w:rPr>
-                <w:rFonts w:ascii="Calibri" w:cs="Calibri" w:eastAsia="Calibri" w:hAnsi="Calibri"/>
-                <w:b w:val="false"/>
-                <w:bCs w:val="false"/>
-                <w:i/>
-                <w:iCs/>
-                <w:sz w:val="19"/>
-                <w:szCs w:val="19"/>
-              </w:rPr>
-              <w:t xml:space="preserve">(part 1)</w:t>
+              <w:t xml:space="preserve">S1-08 · As an agent, I want the system to draft a reply with AI using the ticket and its department template, so that I don't write every reply from scratch.</w:t>
             </w:r>
           </w:p>
         </w:tc>
@@ -3185,7 +3113,7 @@
                 <w:sz w:val="19"/>
                 <w:szCs w:val="19"/>
               </w:rPr>
-              <w:t xml:space="preserve">Gemini called from a server-side API route; key never reaches the browser; draft builds on the category's template</w:t>
+              <w:t xml:space="preserve">Gemini called from a server-side API route; key never reaches the browser; draft builds on the template for the ticket's department</w:t>
             </w:r>
           </w:p>
         </w:tc>
@@ -3315,19 +3243,7 @@
                 <w:sz w:val="19"/>
                 <w:szCs w:val="19"/>
               </w:rPr>
-              <w:t xml:space="preserve">S1-03 · As a staff member, I want to sign in, so that my requests are linked to me and I only see my own. </w:t>
-            </w:r>
-            <w:r>
-              <w:rPr>
-                <w:rFonts w:ascii="Calibri" w:cs="Calibri" w:eastAsia="Calibri" w:hAnsi="Calibri"/>
-                <w:b w:val="false"/>
-                <w:bCs w:val="false"/>
-                <w:i/>
-                <w:iCs/>
-                <w:sz w:val="19"/>
-                <w:szCs w:val="19"/>
-              </w:rPr>
-              <w:t xml:space="preserve">(part 1)</w:t>
+              <w:t xml:space="preserve">S1-09 · As a staff member, I want to sign in with my email, so that Relay knows who I am and shows me the right home screen.</w:t>
             </w:r>
           </w:p>
         </w:tc>
@@ -3357,7 +3273,7 @@
                 <w:sz w:val="19"/>
                 <w:szCs w:val="19"/>
               </w:rPr>
-              <w:t xml:space="preserve">Email sign-in with Supabase Auth; profiles created with roles staff, agent, manager and compliance; each role lands on its own home screen</w:t>
+              <w:t xml:space="preserve">Email sign-in with Supabase Auth; each user has a role (staff, agent, manager or compliance); each role lands on its own home screen</w:t>
             </w:r>
           </w:p>
         </w:tc>
@@ -3464,19 +3380,7 @@
                 <w:sz w:val="19"/>
                 <w:szCs w:val="19"/>
               </w:rPr>
-              <w:t xml:space="preserve">S1-06 · As the team, I want a trained classifier with honest accuracy figures, so that we know how reliable the routing is. </w:t>
-            </w:r>
-            <w:r>
-              <w:rPr>
-                <w:rFonts w:ascii="Calibri" w:cs="Calibri" w:eastAsia="Calibri" w:hAnsi="Calibri"/>
-                <w:b w:val="false"/>
-                <w:bCs w:val="false"/>
-                <w:i/>
-                <w:iCs/>
-                <w:sz w:val="19"/>
-                <w:szCs w:val="19"/>
-              </w:rPr>
-              <w:t xml:space="preserve">(part 1)</w:t>
+              <w:t xml:space="preserve">S1-10 · As the data developer, I want a first classifier trained and tested, so that we know how accurately it routes tickets.</w:t>
             </w:r>
           </w:p>
         </w:tc>
@@ -3506,7 +3410,7 @@
                 <w:sz w:val="19"/>
                 <w:szCs w:val="19"/>
               </w:rPr>
-              <w:t xml:space="preserve">TF-IDF + logistic regression trained in Google Colab; accuracy reported separately on held-out real tickets and on synthetic tickets</w:t>
+              <w:t xml:space="preserve">TF-IDF + logistic regression trained in Google Colab; accuracy reported separately on real tickets it hasn't seen and on synthetic tickets</w:t>
             </w:r>
           </w:p>
         </w:tc>
@@ -3613,41 +3517,7 @@
                 <w:sz w:val="19"/>
                 <w:szCs w:val="19"/>
               </w:rPr>
-              <w:t xml:space="preserve">S1-10 · Wireframe review </w:t>
-            </w:r>
-            <w:r>
-              <w:rPr>
-                <w:rFonts w:ascii="Calibri" w:cs="Calibri" w:eastAsia="Calibri" w:hAnsi="Calibri"/>
-                <w:b w:val="false"/>
-                <w:bCs w:val="false"/>
-                <w:i/>
-                <w:iCs/>
-                <w:sz w:val="19"/>
-                <w:szCs w:val="19"/>
-              </w:rPr>
-              <w:t xml:space="preserve">(part 3)</w:t>
-            </w:r>
-            <w:r>
-              <w:rPr>
-                <w:rFonts w:ascii="Calibri" w:cs="Calibri" w:eastAsia="Calibri" w:hAnsi="Calibri"/>
-                <w:b w:val="false"/>
-                <w:bCs w:val="false"/>
-                <w:sz w:val="19"/>
-                <w:szCs w:val="19"/>
-              </w:rPr>
-              <w:t xml:space="preserve"> and S1-11 · As the team, I want one design system, so that every module looks like the same product. </w:t>
-            </w:r>
-            <w:r>
-              <w:rPr>
-                <w:rFonts w:ascii="Calibri" w:cs="Calibri" w:eastAsia="Calibri" w:hAnsi="Calibri"/>
-                <w:b w:val="false"/>
-                <w:bCs w:val="false"/>
-                <w:i/>
-                <w:iCs/>
-                <w:sz w:val="19"/>
-                <w:szCs w:val="19"/>
-              </w:rPr>
-              <w:t xml:space="preserve">(part 1)</w:t>
+              <w:t xml:space="preserve">S1-11 · As the team, I want the wireframes reviewed by classmates, so that confusing screens are fixed before we build them.</w:t>
             </w:r>
           </w:p>
         </w:tc>
@@ -3677,7 +3547,7 @@
                 <w:sz w:val="19"/>
                 <w:szCs w:val="19"/>
               </w:rPr>
-              <w:t xml:space="preserve">Wireframes reviewed with 2–3 classmates and changes noted; colours, type and spacing defined; Tailwind and shadcn/ui set up</w:t>
+              <w:t xml:space="preserve">Wireframes walked through with 2–3 classmates; problems noted; wireframes updated</w:t>
             </w:r>
           </w:p>
         </w:tc>
@@ -3754,7 +3624,7 @@
                 <w:sz w:val="19"/>
                 <w:szCs w:val="19"/>
               </w:rPr>
-              <w:t xml:space="preserve">Baphakamise</w:t>
+              <w:t xml:space="preserve">Mihlali</w:t>
             </w:r>
           </w:p>
         </w:tc>
@@ -3784,29 +3654,7 @@
                 <w:sz w:val="19"/>
                 <w:szCs w:val="19"/>
               </w:rPr>
-              <w:t xml:space="preserve">S1-14 · AI drafts </w:t>
-            </w:r>
-            <w:r>
-              <w:rPr>
-                <w:rFonts w:ascii="Calibri" w:cs="Calibri" w:eastAsia="Calibri" w:hAnsi="Calibri"/>
-                <w:b w:val="false"/>
-                <w:bCs w:val="false"/>
-                <w:i/>
-                <w:iCs/>
-                <w:sz w:val="19"/>
-                <w:szCs w:val="19"/>
-              </w:rPr>
-              <w:t xml:space="preserve">(part 2)</w:t>
-            </w:r>
-            <w:r>
-              <w:rPr>
-                <w:rFonts w:ascii="Calibri" w:cs="Calibri" w:eastAsia="Calibri" w:hAnsi="Calibri"/>
-                <w:b w:val="false"/>
-                <w:bCs w:val="false"/>
-                <w:sz w:val="19"/>
-                <w:szCs w:val="19"/>
-              </w:rPr>
-              <w:t xml:space="preserve"> and S1-16 · As an agent, I want to switch the reply's tone, so that it suits the situation.</w:t>
+              <w:t xml:space="preserve">S1-12 · As a developer, I want shared colours, fonts and components set up, so that every screen looks like the same product.</w:t>
             </w:r>
           </w:p>
         </w:tc>
@@ -3836,7 +3684,7 @@
                 <w:sz w:val="19"/>
                 <w:szCs w:val="19"/>
               </w:rPr>
-              <w:t xml:space="preserve">Draft saved to the responses table; template used if Gemini fails or times out; tone toggle (formal, friendly, urgent) regenerates the draft; tone saved</w:t>
+              <w:t xml:space="preserve">Colours, type and spacing defined; Tailwind and shadcn/ui set up in the repo</w:t>
             </w:r>
           </w:p>
         </w:tc>
@@ -3877,27 +3725,34 @@
         </w:trPr>
         <w:tc>
           <w:tcPr>
-            <w:tcW w:type="dxa" w:w="1500"/>
-            <w:vMerge w:val="restart"/>
-            <w:tcBorders>
-              <w:top w:val="single" w:color="BFBFBF" w:sz="4"/>
-              <w:left w:val="single" w:color="BFBFBF" w:sz="4"/>
-              <w:bottom w:val="single" w:color="BFBFBF" w:sz="4"/>
-              <w:right w:val="single" w:color="BFBFBF" w:sz="4"/>
-            </w:tcBorders>
-            <w:shd w:fill="F0EFEC" w:color="auto" w:val="clear"/>
-            <w:tcMar>
-              <w:top w:type="dxa" w:w="70"/>
-              <w:left w:type="dxa" w:w="110"/>
-              <w:bottom w:type="dxa" w:w="70"/>
-              <w:right w:type="dxa" w:w="110"/>
-            </w:tcMar>
-            <w:vAlign w:val="center"/>
-          </w:tcPr>
-          <w:p>
-            <w:pPr>
-              <w:jc w:val="center"/>
-            </w:pPr>
+            <w:vMerge w:val="continue"/>
+            <w:tcBorders>
+              <w:top w:val="single" w:color="BFBFBF" w:sz="4"/>
+              <w:left w:val="single" w:color="BFBFBF" w:sz="4"/>
+              <w:bottom w:val="single" w:color="BFBFBF" w:sz="4"/>
+              <w:right w:val="single" w:color="BFBFBF" w:sz="4"/>
+            </w:tcBorders>
+          </w:tcPr>
+          <w:p/>
+        </w:tc>
+        <w:tc>
+          <w:tcPr>
+            <w:tcW w:type="dxa" w:w="1700"/>
+            <w:tcBorders>
+              <w:top w:val="single" w:color="BFBFBF" w:sz="4"/>
+              <w:left w:val="single" w:color="BFBFBF" w:sz="4"/>
+              <w:bottom w:val="single" w:color="BFBFBF" w:sz="4"/>
+              <w:right w:val="single" w:color="BFBFBF" w:sz="4"/>
+            </w:tcBorders>
+            <w:tcMar>
+              <w:top w:type="dxa" w:w="70"/>
+              <w:left w:type="dxa" w:w="110"/>
+              <w:bottom w:type="dxa" w:w="70"/>
+              <w:right w:type="dxa" w:w="110"/>
+            </w:tcMar>
+            <w:vAlign w:val="top"/>
+          </w:tcPr>
+          <w:p>
             <w:r>
               <w:rPr>
                 <w:rFonts w:ascii="Calibri" w:cs="Calibri" w:eastAsia="Calibri" w:hAnsi="Calibri"/>
@@ -3906,38 +3761,7 @@
                 <w:sz w:val="19"/>
                 <w:szCs w:val="19"/>
               </w:rPr>
-              <w:t xml:space="preserve">Mon 26 Oct</w:t>
-            </w:r>
-          </w:p>
-        </w:tc>
-        <w:tc>
-          <w:tcPr>
-            <w:tcW w:type="dxa" w:w="1700"/>
-            <w:tcBorders>
-              <w:top w:val="single" w:color="BFBFBF" w:sz="4"/>
-              <w:left w:val="single" w:color="BFBFBF" w:sz="4"/>
-              <w:bottom w:val="single" w:color="BFBFBF" w:sz="4"/>
-              <w:right w:val="single" w:color="BFBFBF" w:sz="4"/>
-            </w:tcBorders>
-            <w:shd w:fill="F0EFEC" w:color="auto" w:val="clear"/>
-            <w:tcMar>
-              <w:top w:type="dxa" w:w="70"/>
-              <w:left w:type="dxa" w:w="110"/>
-              <w:bottom w:type="dxa" w:w="70"/>
-              <w:right w:type="dxa" w:w="110"/>
-            </w:tcMar>
-            <w:vAlign w:val="top"/>
-          </w:tcPr>
-          <w:p>
-            <w:r>
-              <w:rPr>
-                <w:rFonts w:ascii="Calibri" w:cs="Calibri" w:eastAsia="Calibri" w:hAnsi="Calibri"/>
-                <w:b/>
-                <w:bCs/>
-                <w:sz w:val="19"/>
-                <w:szCs w:val="19"/>
-              </w:rPr>
-              <w:t xml:space="preserve">Samukelo</w:t>
+              <w:t xml:space="preserve">Baphakamise</w:t>
             </w:r>
           </w:p>
         </w:tc>
@@ -3950,37 +3774,24 @@
               <w:bottom w:val="single" w:color="BFBFBF" w:sz="4"/>
               <w:right w:val="single" w:color="BFBFBF" w:sz="4"/>
             </w:tcBorders>
-            <w:shd w:fill="F0EFEC" w:color="auto" w:val="clear"/>
-            <w:tcMar>
-              <w:top w:type="dxa" w:w="70"/>
-              <w:left w:type="dxa" w:w="110"/>
-              <w:bottom w:type="dxa" w:w="70"/>
-              <w:right w:type="dxa" w:w="110"/>
-            </w:tcMar>
-            <w:vAlign w:val="top"/>
-          </w:tcPr>
-          <w:p>
-            <w:r>
-              <w:rPr>
-                <w:rFonts w:ascii="Calibri" w:cs="Calibri" w:eastAsia="Calibri" w:hAnsi="Calibri"/>
-                <w:b w:val="false"/>
-                <w:bCs w:val="false"/>
-                <w:sz w:val="19"/>
-                <w:szCs w:val="19"/>
-              </w:rPr>
-              <w:t xml:space="preserve">S1-03 · Sign in with roles </w:t>
-            </w:r>
-            <w:r>
-              <w:rPr>
-                <w:rFonts w:ascii="Calibri" w:cs="Calibri" w:eastAsia="Calibri" w:hAnsi="Calibri"/>
-                <w:b w:val="false"/>
-                <w:bCs w:val="false"/>
-                <w:i/>
-                <w:iCs/>
-                <w:sz w:val="19"/>
-                <w:szCs w:val="19"/>
-              </w:rPr>
-              <w:t xml:space="preserve">(part 2)</w:t>
+            <w:tcMar>
+              <w:top w:type="dxa" w:w="70"/>
+              <w:left w:type="dxa" w:w="110"/>
+              <w:bottom w:type="dxa" w:w="70"/>
+              <w:right w:type="dxa" w:w="110"/>
+            </w:tcMar>
+            <w:vAlign w:val="top"/>
+          </w:tcPr>
+          <w:p>
+            <w:r>
+              <w:rPr>
+                <w:rFonts w:ascii="Calibri" w:cs="Calibri" w:eastAsia="Calibri" w:hAnsi="Calibri"/>
+                <w:b w:val="false"/>
+                <w:bCs w:val="false"/>
+                <w:sz w:val="19"/>
+                <w:szCs w:val="19"/>
+              </w:rPr>
+              <w:t xml:space="preserve">S1-13 · As an agent, I want every AI draft saved, with the template used if the AI fails, so that a reply is always ready for me.</w:t>
             </w:r>
           </w:p>
         </w:tc>
@@ -3993,25 +3804,24 @@
               <w:bottom w:val="single" w:color="BFBFBF" w:sz="4"/>
               <w:right w:val="single" w:color="BFBFBF" w:sz="4"/>
             </w:tcBorders>
-            <w:shd w:fill="F0EFEC" w:color="auto" w:val="clear"/>
-            <w:tcMar>
-              <w:top w:type="dxa" w:w="70"/>
-              <w:left w:type="dxa" w:w="110"/>
-              <w:bottom w:type="dxa" w:w="70"/>
-              <w:right w:type="dxa" w:w="110"/>
-            </w:tcMar>
-            <w:vAlign w:val="top"/>
-          </w:tcPr>
-          <w:p>
-            <w:r>
-              <w:rPr>
-                <w:rFonts w:ascii="Calibri" w:cs="Calibri" w:eastAsia="Calibri" w:hAnsi="Calibri"/>
-                <w:b w:val="false"/>
-                <w:bCs w:val="false"/>
-                <w:sz w:val="19"/>
-                <w:szCs w:val="19"/>
-              </w:rPr>
-              <w:t xml:space="preserve">Row-level security policies added; staff see only their own requests; staff cannot open agent or manager pages</w:t>
+            <w:tcMar>
+              <w:top w:type="dxa" w:w="70"/>
+              <w:left w:type="dxa" w:w="110"/>
+              <w:bottom w:type="dxa" w:w="70"/>
+              <w:right w:type="dxa" w:w="110"/>
+            </w:tcMar>
+            <w:vAlign w:val="top"/>
+          </w:tcPr>
+          <w:p>
+            <w:r>
+              <w:rPr>
+                <w:rFonts w:ascii="Calibri" w:cs="Calibri" w:eastAsia="Calibri" w:hAnsi="Calibri"/>
+                <w:b w:val="false"/>
+                <w:bCs w:val="false"/>
+                <w:sz w:val="19"/>
+                <w:szCs w:val="19"/>
+              </w:rPr>
+              <w:t xml:space="preserve">Draft saved to the responses table; template text used if Gemini fails or takes too long</w:t>
             </w:r>
           </w:p>
         </w:tc>
@@ -4024,7 +3834,6 @@
               <w:bottom w:val="single" w:color="BFBFBF" w:sz="4"/>
               <w:right w:val="single" w:color="BFBFBF" w:sz="4"/>
             </w:tcBorders>
-            <w:shd w:fill="F0EFEC" w:color="auto" w:val="clear"/>
             <w:tcMar>
               <w:top w:type="dxa" w:w="70"/>
               <w:left w:type="dxa" w:w="110"/>
@@ -4072,7 +3881,6 @@
               <w:bottom w:val="single" w:color="BFBFBF" w:sz="4"/>
               <w:right w:val="single" w:color="BFBFBF" w:sz="4"/>
             </w:tcBorders>
-            <w:shd w:fill="F0EFEC" w:color="auto" w:val="clear"/>
             <w:tcMar>
               <w:top w:type="dxa" w:w="70"/>
               <w:left w:type="dxa" w:w="110"/>
@@ -4090,7 +3898,7 @@
                 <w:sz w:val="19"/>
                 <w:szCs w:val="19"/>
               </w:rPr>
-              <w:t xml:space="preserve">Elzel</w:t>
+              <w:t xml:space="preserve">Baphakamise</w:t>
             </w:r>
           </w:p>
         </w:tc>
@@ -4103,47 +3911,24 @@
               <w:bottom w:val="single" w:color="BFBFBF" w:sz="4"/>
               <w:right w:val="single" w:color="BFBFBF" w:sz="4"/>
             </w:tcBorders>
-            <w:shd w:fill="F0EFEC" w:color="auto" w:val="clear"/>
-            <w:tcMar>
-              <w:top w:type="dxa" w:w="70"/>
-              <w:left w:type="dxa" w:w="110"/>
-              <w:bottom w:type="dxa" w:w="70"/>
-              <w:right w:type="dxa" w:w="110"/>
-            </w:tcMar>
-            <w:vAlign w:val="top"/>
-          </w:tcPr>
-          <w:p>
-            <w:r>
-              <w:rPr>
-                <w:rFonts w:ascii="Calibri" w:cs="Calibri" w:eastAsia="Calibri" w:hAnsi="Calibri"/>
-                <w:b w:val="false"/>
-                <w:bCs w:val="false"/>
-                <w:sz w:val="19"/>
-                <w:szCs w:val="19"/>
-              </w:rPr>
-              <w:t xml:space="preserve">S1-06 · Trained classifier </w:t>
-            </w:r>
-            <w:r>
-              <w:rPr>
-                <w:rFonts w:ascii="Calibri" w:cs="Calibri" w:eastAsia="Calibri" w:hAnsi="Calibri"/>
-                <w:b w:val="false"/>
-                <w:bCs w:val="false"/>
-                <w:i/>
-                <w:iCs/>
-                <w:sz w:val="19"/>
-                <w:szCs w:val="19"/>
-              </w:rPr>
-              <w:t xml:space="preserve">(part 2)</w:t>
-            </w:r>
-            <w:r>
-              <w:rPr>
-                <w:rFonts w:ascii="Calibri" w:cs="Calibri" w:eastAsia="Calibri" w:hAnsi="Calibri"/>
-                <w:b w:val="false"/>
-                <w:bCs w:val="false"/>
-                <w:sz w:val="19"/>
-                <w:szCs w:val="19"/>
-              </w:rPr>
-              <w:t xml:space="preserve"> and S1-09 · As the team, I want the database loaded with historical tickets, so that the next sprint's dashboard has data from day one.</w:t>
+            <w:tcMar>
+              <w:top w:type="dxa" w:w="70"/>
+              <w:left w:type="dxa" w:w="110"/>
+              <w:bottom w:type="dxa" w:w="70"/>
+              <w:right w:type="dxa" w:w="110"/>
+            </w:tcMar>
+            <w:vAlign w:val="top"/>
+          </w:tcPr>
+          <w:p>
+            <w:r>
+              <w:rPr>
+                <w:rFonts w:ascii="Calibri" w:cs="Calibri" w:eastAsia="Calibri" w:hAnsi="Calibri"/>
+                <w:b w:val="false"/>
+                <w:bCs w:val="false"/>
+                <w:sz w:val="19"/>
+                <w:szCs w:val="19"/>
+              </w:rPr>
+              <w:t xml:space="preserve">S1-14 · As an agent, I want to switch the reply's tone between formal, friendly and urgent, so that it suits the situation.</w:t>
             </w:r>
           </w:p>
         </w:tc>
@@ -4156,25 +3941,24 @@
               <w:bottom w:val="single" w:color="BFBFBF" w:sz="4"/>
               <w:right w:val="single" w:color="BFBFBF" w:sz="4"/>
             </w:tcBorders>
-            <w:shd w:fill="F0EFEC" w:color="auto" w:val="clear"/>
-            <w:tcMar>
-              <w:top w:type="dxa" w:w="70"/>
-              <w:left w:type="dxa" w:w="110"/>
-              <w:bottom w:type="dxa" w:w="70"/>
-              <w:right w:type="dxa" w:w="110"/>
-            </w:tcMar>
-            <w:vAlign w:val="top"/>
-          </w:tcPr>
-          <w:p>
-            <w:r>
-              <w:rPr>
-                <w:rFonts w:ascii="Calibri" w:cs="Calibri" w:eastAsia="Calibri" w:hAnsi="Calibri"/>
-                <w:b w:val="false"/>
-                <w:bCs w:val="false"/>
-                <w:sz w:val="19"/>
-                <w:szCs w:val="19"/>
-              </w:rPr>
-              <w:t xml:space="preserve">Confusion matrix included; 85% or higher on held-out real tickets; notebook saved in ml/notebooks; model weights exported to JSON; historical tickets imported with original timestamps by a repeatable seed script</w:t>
+            <w:tcMar>
+              <w:top w:type="dxa" w:w="70"/>
+              <w:left w:type="dxa" w:w="110"/>
+              <w:bottom w:type="dxa" w:w="70"/>
+              <w:right w:type="dxa" w:w="110"/>
+            </w:tcMar>
+            <w:vAlign w:val="top"/>
+          </w:tcPr>
+          <w:p>
+            <w:r>
+              <w:rPr>
+                <w:rFonts w:ascii="Calibri" w:cs="Calibri" w:eastAsia="Calibri" w:hAnsi="Calibri"/>
+                <w:b w:val="false"/>
+                <w:bCs w:val="false"/>
+                <w:sz w:val="19"/>
+                <w:szCs w:val="19"/>
+              </w:rPr>
+              <w:t xml:space="preserve">Tone toggle with three options; switching tone creates a new draft; the tone used is saved with the reply</w:t>
             </w:r>
           </w:p>
         </w:tc>
@@ -4187,7 +3971,6 @@
               <w:bottom w:val="single" w:color="BFBFBF" w:sz="4"/>
               <w:right w:val="single" w:color="BFBFBF" w:sz="4"/>
             </w:tcBorders>
-            <w:shd w:fill="F0EFEC" w:color="auto" w:val="clear"/>
             <w:tcMar>
               <w:top w:type="dxa" w:w="70"/>
               <w:left w:type="dxa" w:w="110"/>
@@ -4216,35 +3999,27 @@
         </w:trPr>
         <w:tc>
           <w:tcPr>
-            <w:vMerge w:val="continue"/>
-            <w:tcBorders>
-              <w:top w:val="single" w:color="BFBFBF" w:sz="4"/>
-              <w:left w:val="single" w:color="BFBFBF" w:sz="4"/>
-              <w:bottom w:val="single" w:color="BFBFBF" w:sz="4"/>
-              <w:right w:val="single" w:color="BFBFBF" w:sz="4"/>
-            </w:tcBorders>
-          </w:tcPr>
-          <w:p/>
-        </w:tc>
-        <w:tc>
-          <w:tcPr>
-            <w:tcW w:type="dxa" w:w="1700"/>
-            <w:tcBorders>
-              <w:top w:val="single" w:color="BFBFBF" w:sz="4"/>
-              <w:left w:val="single" w:color="BFBFBF" w:sz="4"/>
-              <w:bottom w:val="single" w:color="BFBFBF" w:sz="4"/>
-              <w:right w:val="single" w:color="BFBFBF" w:sz="4"/>
-            </w:tcBorders>
-            <w:shd w:fill="F0EFEC" w:color="auto" w:val="clear"/>
-            <w:tcMar>
-              <w:top w:type="dxa" w:w="70"/>
-              <w:left w:type="dxa" w:w="110"/>
-              <w:bottom w:type="dxa" w:w="70"/>
-              <w:right w:type="dxa" w:w="110"/>
-            </w:tcMar>
-            <w:vAlign w:val="top"/>
-          </w:tcPr>
-          <w:p>
+            <w:tcW w:type="dxa" w:w="1500"/>
+            <w:vMerge w:val="restart"/>
+            <w:tcBorders>
+              <w:top w:val="single" w:color="BFBFBF" w:sz="4"/>
+              <w:left w:val="single" w:color="BFBFBF" w:sz="4"/>
+              <w:bottom w:val="single" w:color="BFBFBF" w:sz="4"/>
+              <w:right w:val="single" w:color="BFBFBF" w:sz="4"/>
+            </w:tcBorders>
+            <w:shd w:fill="F0EFEC" w:color="auto" w:val="clear"/>
+            <w:tcMar>
+              <w:top w:type="dxa" w:w="70"/>
+              <w:left w:type="dxa" w:w="110"/>
+              <w:bottom w:type="dxa" w:w="70"/>
+              <w:right w:type="dxa" w:w="110"/>
+            </w:tcMar>
+            <w:vAlign w:val="center"/>
+          </w:tcPr>
+          <w:p>
+            <w:pPr>
+              <w:jc w:val="center"/>
+            </w:pPr>
             <w:r>
               <w:rPr>
                 <w:rFonts w:ascii="Calibri" w:cs="Calibri" w:eastAsia="Calibri" w:hAnsi="Calibri"/>
@@ -4253,7 +4028,38 @@
                 <w:sz w:val="19"/>
                 <w:szCs w:val="19"/>
               </w:rPr>
-              <w:t xml:space="preserve">Mihlali</w:t>
+              <w:t xml:space="preserve">Mon 26 Oct</w:t>
+            </w:r>
+          </w:p>
+        </w:tc>
+        <w:tc>
+          <w:tcPr>
+            <w:tcW w:type="dxa" w:w="1700"/>
+            <w:tcBorders>
+              <w:top w:val="single" w:color="BFBFBF" w:sz="4"/>
+              <w:left w:val="single" w:color="BFBFBF" w:sz="4"/>
+              <w:bottom w:val="single" w:color="BFBFBF" w:sz="4"/>
+              <w:right w:val="single" w:color="BFBFBF" w:sz="4"/>
+            </w:tcBorders>
+            <w:shd w:fill="F0EFEC" w:color="auto" w:val="clear"/>
+            <w:tcMar>
+              <w:top w:type="dxa" w:w="70"/>
+              <w:left w:type="dxa" w:w="110"/>
+              <w:bottom w:type="dxa" w:w="70"/>
+              <w:right w:type="dxa" w:w="110"/>
+            </w:tcMar>
+            <w:vAlign w:val="top"/>
+          </w:tcPr>
+          <w:p>
+            <w:r>
+              <w:rPr>
+                <w:rFonts w:ascii="Calibri" w:cs="Calibri" w:eastAsia="Calibri" w:hAnsi="Calibri"/>
+                <w:b/>
+                <w:bCs/>
+                <w:sz w:val="19"/>
+                <w:szCs w:val="19"/>
+              </w:rPr>
+              <w:t xml:space="preserve">Samukelo</w:t>
             </w:r>
           </w:p>
         </w:tc>
@@ -4284,19 +4090,7 @@
                 <w:sz w:val="19"/>
                 <w:szCs w:val="19"/>
               </w:rPr>
-              <w:t xml:space="preserve">S1-11 · Design system </w:t>
-            </w:r>
-            <w:r>
-              <w:rPr>
-                <w:rFonts w:ascii="Calibri" w:cs="Calibri" w:eastAsia="Calibri" w:hAnsi="Calibri"/>
-                <w:b w:val="false"/>
-                <w:bCs w:val="false"/>
-                <w:i/>
-                <w:iCs/>
-                <w:sz w:val="19"/>
-                <w:szCs w:val="19"/>
-              </w:rPr>
-              <w:t xml:space="preserve">(part 2)</w:t>
+              <w:t xml:space="preserve">S1-15 · As a staff member, I want only me to see my requests, so that my information stays private.</w:t>
             </w:r>
           </w:p>
         </w:tc>
@@ -4327,7 +4121,7 @@
                 <w:sz w:val="19"/>
                 <w:szCs w:val="19"/>
               </w:rPr>
-              <w:t xml:space="preserve">App layout with navigation that changes by role; colour contrast meets WCAG 2.1 AA</w:t>
+              <w:t xml:space="preserve">Row-level security rules added; staff see only their own requests; staff cannot open agent or manager pages</w:t>
             </w:r>
           </w:p>
         </w:tc>
@@ -4406,7 +4200,7 @@
                 <w:sz w:val="19"/>
                 <w:szCs w:val="19"/>
               </w:rPr>
-              <w:t xml:space="preserve">Baphakamise</w:t>
+              <w:t xml:space="preserve">Elzel</w:t>
             </w:r>
           </w:p>
         </w:tc>
@@ -4437,7 +4231,7 @@
                 <w:sz w:val="19"/>
                 <w:szCs w:val="19"/>
               </w:rPr>
-              <w:t xml:space="preserve">S1-17 · As an agent, I want an inbox of my department's tickets, so that I know what to work on next.</w:t>
+              <w:t xml:space="preserve">S1-16 · As the team, I want the classifier to reach 85% accuracy and be saved in a format the app can use, so that it can run inside Relay.</w:t>
             </w:r>
           </w:p>
         </w:tc>
@@ -4468,7 +4262,7 @@
                 <w:sz w:val="19"/>
                 <w:szCs w:val="19"/>
               </w:rPr>
-              <w:t xml:space="preserve">Shows only my department's tickets; sorted by priority then oldest first; filter by status; "Needs review" tickets clearly marked</w:t>
+              <w:t xml:space="preserve">Confusion matrix included; 85% or higher on real tickets it hasn't seen; notebook saved in ml/notebooks; model exported to JSON in ml/model</w:t>
             </w:r>
           </w:p>
         </w:tc>
@@ -4510,26 +4304,35 @@
         </w:trPr>
         <w:tc>
           <w:tcPr>
-            <w:tcW w:type="dxa" w:w="1500"/>
-            <w:vMerge w:val="restart"/>
-            <w:tcBorders>
-              <w:top w:val="single" w:color="BFBFBF" w:sz="4"/>
-              <w:left w:val="single" w:color="BFBFBF" w:sz="4"/>
-              <w:bottom w:val="single" w:color="BFBFBF" w:sz="4"/>
-              <w:right w:val="single" w:color="BFBFBF" w:sz="4"/>
-            </w:tcBorders>
-            <w:tcMar>
-              <w:top w:type="dxa" w:w="70"/>
-              <w:left w:type="dxa" w:w="110"/>
-              <w:bottom w:type="dxa" w:w="70"/>
-              <w:right w:type="dxa" w:w="110"/>
-            </w:tcMar>
-            <w:vAlign w:val="center"/>
-          </w:tcPr>
-          <w:p>
-            <w:pPr>
-              <w:jc w:val="center"/>
-            </w:pPr>
+            <w:vMerge w:val="continue"/>
+            <w:tcBorders>
+              <w:top w:val="single" w:color="BFBFBF" w:sz="4"/>
+              <w:left w:val="single" w:color="BFBFBF" w:sz="4"/>
+              <w:bottom w:val="single" w:color="BFBFBF" w:sz="4"/>
+              <w:right w:val="single" w:color="BFBFBF" w:sz="4"/>
+            </w:tcBorders>
+          </w:tcPr>
+          <w:p/>
+        </w:tc>
+        <w:tc>
+          <w:tcPr>
+            <w:tcW w:type="dxa" w:w="1700"/>
+            <w:tcBorders>
+              <w:top w:val="single" w:color="BFBFBF" w:sz="4"/>
+              <w:left w:val="single" w:color="BFBFBF" w:sz="4"/>
+              <w:bottom w:val="single" w:color="BFBFBF" w:sz="4"/>
+              <w:right w:val="single" w:color="BFBFBF" w:sz="4"/>
+            </w:tcBorders>
+            <w:shd w:fill="F0EFEC" w:color="auto" w:val="clear"/>
+            <w:tcMar>
+              <w:top w:type="dxa" w:w="70"/>
+              <w:left w:type="dxa" w:w="110"/>
+              <w:bottom w:type="dxa" w:w="70"/>
+              <w:right w:type="dxa" w:w="110"/>
+            </w:tcMar>
+            <w:vAlign w:val="top"/>
+          </w:tcPr>
+          <w:p>
             <w:r>
               <w:rPr>
                 <w:rFonts w:ascii="Calibri" w:cs="Calibri" w:eastAsia="Calibri" w:hAnsi="Calibri"/>
@@ -4538,37 +4341,7 @@
                 <w:sz w:val="19"/>
                 <w:szCs w:val="19"/>
               </w:rPr>
-              <w:t xml:space="preserve">Tue 27 Oct</w:t>
-            </w:r>
-          </w:p>
-        </w:tc>
-        <w:tc>
-          <w:tcPr>
-            <w:tcW w:type="dxa" w:w="1700"/>
-            <w:tcBorders>
-              <w:top w:val="single" w:color="BFBFBF" w:sz="4"/>
-              <w:left w:val="single" w:color="BFBFBF" w:sz="4"/>
-              <w:bottom w:val="single" w:color="BFBFBF" w:sz="4"/>
-              <w:right w:val="single" w:color="BFBFBF" w:sz="4"/>
-            </w:tcBorders>
-            <w:tcMar>
-              <w:top w:type="dxa" w:w="70"/>
-              <w:left w:type="dxa" w:w="110"/>
-              <w:bottom w:type="dxa" w:w="70"/>
-              <w:right w:type="dxa" w:w="110"/>
-            </w:tcMar>
-            <w:vAlign w:val="top"/>
-          </w:tcPr>
-          <w:p>
-            <w:r>
-              <w:rPr>
-                <w:rFonts w:ascii="Calibri" w:cs="Calibri" w:eastAsia="Calibri" w:hAnsi="Calibri"/>
-                <w:b/>
-                <w:bCs/>
-                <w:sz w:val="19"/>
-                <w:szCs w:val="19"/>
-              </w:rPr>
-              <w:t xml:space="preserve">Samukelo</w:t>
+              <w:t xml:space="preserve">Elzel</w:t>
             </w:r>
           </w:p>
         </w:tc>
@@ -4581,36 +4354,25 @@
               <w:bottom w:val="single" w:color="BFBFBF" w:sz="4"/>
               <w:right w:val="single" w:color="BFBFBF" w:sz="4"/>
             </w:tcBorders>
-            <w:tcMar>
-              <w:top w:type="dxa" w:w="70"/>
-              <w:left w:type="dxa" w:w="110"/>
-              <w:bottom w:type="dxa" w:w="70"/>
-              <w:right w:type="dxa" w:w="110"/>
-            </w:tcMar>
-            <w:vAlign w:val="top"/>
-          </w:tcPr>
-          <w:p>
-            <w:r>
-              <w:rPr>
-                <w:rFonts w:ascii="Calibri" w:cs="Calibri" w:eastAsia="Calibri" w:hAnsi="Calibri"/>
-                <w:b w:val="false"/>
-                <w:bCs w:val="false"/>
-                <w:sz w:val="19"/>
-                <w:szCs w:val="19"/>
-              </w:rPr>
-              <w:t xml:space="preserve">S1-04 · As a CAPACITI assessor, I want an architecture document, so that I can understand how Relay is built without reading the code. </w:t>
-            </w:r>
-            <w:r>
-              <w:rPr>
-                <w:rFonts w:ascii="Calibri" w:cs="Calibri" w:eastAsia="Calibri" w:hAnsi="Calibri"/>
-                <w:b w:val="false"/>
-                <w:bCs w:val="false"/>
-                <w:i/>
-                <w:iCs/>
-                <w:sz w:val="19"/>
-                <w:szCs w:val="19"/>
-              </w:rPr>
-              <w:t xml:space="preserve">(part 1)</w:t>
+            <w:shd w:fill="F0EFEC" w:color="auto" w:val="clear"/>
+            <w:tcMar>
+              <w:top w:type="dxa" w:w="70"/>
+              <w:left w:type="dxa" w:w="110"/>
+              <w:bottom w:type="dxa" w:w="70"/>
+              <w:right w:type="dxa" w:w="110"/>
+            </w:tcMar>
+            <w:vAlign w:val="top"/>
+          </w:tcPr>
+          <w:p>
+            <w:r>
+              <w:rPr>
+                <w:rFonts w:ascii="Calibri" w:cs="Calibri" w:eastAsia="Calibri" w:hAnsi="Calibri"/>
+                <w:b w:val="false"/>
+                <w:bCs w:val="false"/>
+                <w:sz w:val="19"/>
+                <w:szCs w:val="19"/>
+              </w:rPr>
+              <w:t xml:space="preserve">S1-17 · As a manager, I want past tickets loaded into the database, so that next sprint's dashboard has history to show.</w:t>
             </w:r>
           </w:p>
         </w:tc>
@@ -4623,24 +4385,25 @@
               <w:bottom w:val="single" w:color="BFBFBF" w:sz="4"/>
               <w:right w:val="single" w:color="BFBFBF" w:sz="4"/>
             </w:tcBorders>
-            <w:tcMar>
-              <w:top w:type="dxa" w:w="70"/>
-              <w:left w:type="dxa" w:w="110"/>
-              <w:bottom w:type="dxa" w:w="70"/>
-              <w:right w:type="dxa" w:w="110"/>
-            </w:tcMar>
-            <w:vAlign w:val="top"/>
-          </w:tcPr>
-          <w:p>
-            <w:r>
-              <w:rPr>
-                <w:rFonts w:ascii="Calibri" w:cs="Calibri" w:eastAsia="Calibri" w:hAnsi="Calibri"/>
-                <w:b w:val="false"/>
-                <w:bCs w:val="false"/>
-                <w:sz w:val="19"/>
-                <w:szCs w:val="19"/>
-              </w:rPr>
-              <w:t xml:space="preserve">Architecture diagram; components and why they were chosen; data model</w:t>
+            <w:shd w:fill="F0EFEC" w:color="auto" w:val="clear"/>
+            <w:tcMar>
+              <w:top w:type="dxa" w:w="70"/>
+              <w:left w:type="dxa" w:w="110"/>
+              <w:bottom w:type="dxa" w:w="70"/>
+              <w:right w:type="dxa" w:w="110"/>
+            </w:tcMar>
+            <w:vAlign w:val="top"/>
+          </w:tcPr>
+          <w:p>
+            <w:r>
+              <w:rPr>
+                <w:rFonts w:ascii="Calibri" w:cs="Calibri" w:eastAsia="Calibri" w:hAnsi="Calibri"/>
+                <w:b w:val="false"/>
+                <w:bCs w:val="false"/>
+                <w:sz w:val="19"/>
+                <w:szCs w:val="19"/>
+              </w:rPr>
+              <w:t xml:space="preserve">Historical tickets imported with their original dates; seed script saved in supabase/seed so it can be run again</w:t>
             </w:r>
           </w:p>
         </w:tc>
@@ -4653,6 +4416,7 @@
               <w:bottom w:val="single" w:color="BFBFBF" w:sz="4"/>
               <w:right w:val="single" w:color="BFBFBF" w:sz="4"/>
             </w:tcBorders>
+            <w:shd w:fill="F0EFEC" w:color="auto" w:val="clear"/>
             <w:tcMar>
               <w:top w:type="dxa" w:w="70"/>
               <w:left w:type="dxa" w:w="110"/>
@@ -4700,6 +4464,7 @@
               <w:bottom w:val="single" w:color="BFBFBF" w:sz="4"/>
               <w:right w:val="single" w:color="BFBFBF" w:sz="4"/>
             </w:tcBorders>
+            <w:shd w:fill="F0EFEC" w:color="auto" w:val="clear"/>
             <w:tcMar>
               <w:top w:type="dxa" w:w="70"/>
               <w:left w:type="dxa" w:w="110"/>
@@ -4717,7 +4482,7 @@
                 <w:sz w:val="19"/>
                 <w:szCs w:val="19"/>
               </w:rPr>
-              <w:t xml:space="preserve">Elzel</w:t>
+              <w:t xml:space="preserve">Mihlali</w:t>
             </w:r>
           </w:p>
         </w:tc>
@@ -4730,24 +4495,25 @@
               <w:bottom w:val="single" w:color="BFBFBF" w:sz="4"/>
               <w:right w:val="single" w:color="BFBFBF" w:sz="4"/>
             </w:tcBorders>
-            <w:tcMar>
-              <w:top w:type="dxa" w:w="70"/>
-              <w:left w:type="dxa" w:w="110"/>
-              <w:bottom w:type="dxa" w:w="70"/>
-              <w:right w:type="dxa" w:w="110"/>
-            </w:tcMar>
-            <w:vAlign w:val="top"/>
-          </w:tcPr>
-          <w:p>
-            <w:r>
-              <w:rPr>
-                <w:rFonts w:ascii="Calibri" w:cs="Calibri" w:eastAsia="Calibri" w:hAnsi="Calibri"/>
-                <w:b w:val="false"/>
-                <w:bCs w:val="false"/>
-                <w:sz w:val="19"/>
-                <w:szCs w:val="19"/>
-              </w:rPr>
-              <w:t xml:space="preserve">S1-07 · As a staff member, I want my request sent to the right department automatically, so that I don't need to know who handles what.</w:t>
+            <w:shd w:fill="F0EFEC" w:color="auto" w:val="clear"/>
+            <w:tcMar>
+              <w:top w:type="dxa" w:w="70"/>
+              <w:left w:type="dxa" w:w="110"/>
+              <w:bottom w:type="dxa" w:w="70"/>
+              <w:right w:type="dxa" w:w="110"/>
+            </w:tcMar>
+            <w:vAlign w:val="top"/>
+          </w:tcPr>
+          <w:p>
+            <w:r>
+              <w:rPr>
+                <w:rFonts w:ascii="Calibri" w:cs="Calibri" w:eastAsia="Calibri" w:hAnsi="Calibri"/>
+                <w:b w:val="false"/>
+                <w:bCs w:val="false"/>
+                <w:sz w:val="19"/>
+                <w:szCs w:val="19"/>
+              </w:rPr>
+              <w:t xml:space="preserve">S1-18 · As a user, I want a menu that shows only the pages for my role, so that I can find what I need quickly.</w:t>
             </w:r>
           </w:p>
         </w:tc>
@@ -4760,24 +4526,25 @@
               <w:bottom w:val="single" w:color="BFBFBF" w:sz="4"/>
               <w:right w:val="single" w:color="BFBFBF" w:sz="4"/>
             </w:tcBorders>
-            <w:tcMar>
-              <w:top w:type="dxa" w:w="70"/>
-              <w:left w:type="dxa" w:w="110"/>
-              <w:bottom w:type="dxa" w:w="70"/>
-              <w:right w:type="dxa" w:w="110"/>
-            </w:tcMar>
-            <w:vAlign w:val="top"/>
-          </w:tcPr>
-          <w:p>
-            <w:r>
-              <w:rPr>
-                <w:rFonts w:ascii="Calibri" w:cs="Calibri" w:eastAsia="Calibri" w:hAnsi="Calibri"/>
-                <w:b w:val="false"/>
-                <w:bCs w:val="false"/>
-                <w:sz w:val="19"/>
-                <w:szCs w:val="19"/>
-              </w:rPr>
-              <w:t xml:space="preserve">Stub in /api/classify replaced by the real model; returns category and confidence in under one second; result saved to classifications with the model version</w:t>
+            <w:shd w:fill="F0EFEC" w:color="auto" w:val="clear"/>
+            <w:tcMar>
+              <w:top w:type="dxa" w:w="70"/>
+              <w:left w:type="dxa" w:w="110"/>
+              <w:bottom w:type="dxa" w:w="70"/>
+              <w:right w:type="dxa" w:w="110"/>
+            </w:tcMar>
+            <w:vAlign w:val="top"/>
+          </w:tcPr>
+          <w:p>
+            <w:r>
+              <w:rPr>
+                <w:rFonts w:ascii="Calibri" w:cs="Calibri" w:eastAsia="Calibri" w:hAnsi="Calibri"/>
+                <w:b w:val="false"/>
+                <w:bCs w:val="false"/>
+                <w:sz w:val="19"/>
+                <w:szCs w:val="19"/>
+              </w:rPr>
+              <w:t xml:space="preserve">App layout with a menu that changes by role; colour contrast meets WCAG 2.1 AA</w:t>
             </w:r>
           </w:p>
         </w:tc>
@@ -4790,6 +4557,7 @@
               <w:bottom w:val="single" w:color="BFBFBF" w:sz="4"/>
               <w:right w:val="single" w:color="BFBFBF" w:sz="4"/>
             </w:tcBorders>
+            <w:shd w:fill="F0EFEC" w:color="auto" w:val="clear"/>
             <w:tcMar>
               <w:top w:type="dxa" w:w="70"/>
               <w:left w:type="dxa" w:w="110"/>
@@ -4837,6 +4605,7 @@
               <w:bottom w:val="single" w:color="BFBFBF" w:sz="4"/>
               <w:right w:val="single" w:color="BFBFBF" w:sz="4"/>
             </w:tcBorders>
+            <w:shd w:fill="F0EFEC" w:color="auto" w:val="clear"/>
             <w:tcMar>
               <w:top w:type="dxa" w:w="70"/>
               <w:left w:type="dxa" w:w="110"/>
@@ -4854,7 +4623,7 @@
                 <w:sz w:val="19"/>
                 <w:szCs w:val="19"/>
               </w:rPr>
-              <w:t xml:space="preserve">Mihlali</w:t>
+              <w:t xml:space="preserve">Baphakamise</w:t>
             </w:r>
           </w:p>
         </w:tc>
@@ -4867,24 +4636,25 @@
               <w:bottom w:val="single" w:color="BFBFBF" w:sz="4"/>
               <w:right w:val="single" w:color="BFBFBF" w:sz="4"/>
             </w:tcBorders>
-            <w:tcMar>
-              <w:top w:type="dxa" w:w="70"/>
-              <w:left w:type="dxa" w:w="110"/>
-              <w:bottom w:type="dxa" w:w="70"/>
-              <w:right w:type="dxa" w:w="110"/>
-            </w:tcMar>
-            <w:vAlign w:val="top"/>
-          </w:tcPr>
-          <w:p>
-            <w:r>
-              <w:rPr>
-                <w:rFonts w:ascii="Calibri" w:cs="Calibri" w:eastAsia="Calibri" w:hAnsi="Calibri"/>
-                <w:b w:val="false"/>
-                <w:bCs w:val="false"/>
-                <w:sz w:val="19"/>
-                <w:szCs w:val="19"/>
-              </w:rPr>
-              <w:t xml:space="preserve">S1-12 · As a driver, I want to submit a request from my phone, so that I can get help without calling the office.</w:t>
+            <w:shd w:fill="F0EFEC" w:color="auto" w:val="clear"/>
+            <w:tcMar>
+              <w:top w:type="dxa" w:w="70"/>
+              <w:left w:type="dxa" w:w="110"/>
+              <w:bottom w:type="dxa" w:w="70"/>
+              <w:right w:type="dxa" w:w="110"/>
+            </w:tcMar>
+            <w:vAlign w:val="top"/>
+          </w:tcPr>
+          <w:p>
+            <w:r>
+              <w:rPr>
+                <w:rFonts w:ascii="Calibri" w:cs="Calibri" w:eastAsia="Calibri" w:hAnsi="Calibri"/>
+                <w:b w:val="false"/>
+                <w:bCs w:val="false"/>
+                <w:sz w:val="19"/>
+                <w:szCs w:val="19"/>
+              </w:rPr>
+              <w:t xml:space="preserve">S1-19 · As an agent, I want an inbox of my department's tickets, so that I know what to work on next.</w:t>
             </w:r>
           </w:p>
         </w:tc>
@@ -4897,24 +4667,25 @@
               <w:bottom w:val="single" w:color="BFBFBF" w:sz="4"/>
               <w:right w:val="single" w:color="BFBFBF" w:sz="4"/>
             </w:tcBorders>
-            <w:tcMar>
-              <w:top w:type="dxa" w:w="70"/>
-              <w:left w:type="dxa" w:w="110"/>
-              <w:bottom w:type="dxa" w:w="70"/>
-              <w:right w:type="dxa" w:w="110"/>
-            </w:tcMar>
-            <w:vAlign w:val="top"/>
-          </w:tcPr>
-          <w:p>
-            <w:r>
-              <w:rPr>
-                <w:rFonts w:ascii="Calibri" w:cs="Calibri" w:eastAsia="Calibri" w:hAnsi="Calibri"/>
-                <w:b w:val="false"/>
-                <w:bCs w:val="false"/>
-                <w:sz w:val="19"/>
-                <w:szCs w:val="19"/>
-              </w:rPr>
-              <w:t xml:space="preserve">Subject, description and depot fields, all labelled; works on a 360px screen; clear error messages; after submitting, shows a reference number and the department it went to</w:t>
+            <w:shd w:fill="F0EFEC" w:color="auto" w:val="clear"/>
+            <w:tcMar>
+              <w:top w:type="dxa" w:w="70"/>
+              <w:left w:type="dxa" w:w="110"/>
+              <w:bottom w:type="dxa" w:w="70"/>
+              <w:right w:type="dxa" w:w="110"/>
+            </w:tcMar>
+            <w:vAlign w:val="top"/>
+          </w:tcPr>
+          <w:p>
+            <w:r>
+              <w:rPr>
+                <w:rFonts w:ascii="Calibri" w:cs="Calibri" w:eastAsia="Calibri" w:hAnsi="Calibri"/>
+                <w:b w:val="false"/>
+                <w:bCs w:val="false"/>
+                <w:sz w:val="19"/>
+                <w:szCs w:val="19"/>
+              </w:rPr>
+              <w:t xml:space="preserve">Shows only my department's tickets; most urgent first, then oldest; filter by status; "Needs review" tickets clearly marked</w:t>
             </w:r>
           </w:p>
         </w:tc>
@@ -4927,6 +4698,7 @@
               <w:bottom w:val="single" w:color="BFBFBF" w:sz="4"/>
               <w:right w:val="single" w:color="BFBFBF" w:sz="4"/>
             </w:tcBorders>
+            <w:shd w:fill="F0EFEC" w:color="auto" w:val="clear"/>
             <w:tcMar>
               <w:top w:type="dxa" w:w="70"/>
               <w:left w:type="dxa" w:w="110"/>
@@ -4955,34 +4727,26 @@
         </w:trPr>
         <w:tc>
           <w:tcPr>
-            <w:vMerge w:val="continue"/>
-            <w:tcBorders>
-              <w:top w:val="single" w:color="BFBFBF" w:sz="4"/>
-              <w:left w:val="single" w:color="BFBFBF" w:sz="4"/>
-              <w:bottom w:val="single" w:color="BFBFBF" w:sz="4"/>
-              <w:right w:val="single" w:color="BFBFBF" w:sz="4"/>
-            </w:tcBorders>
-          </w:tcPr>
-          <w:p/>
-        </w:tc>
-        <w:tc>
-          <w:tcPr>
-            <w:tcW w:type="dxa" w:w="1700"/>
-            <w:tcBorders>
-              <w:top w:val="single" w:color="BFBFBF" w:sz="4"/>
-              <w:left w:val="single" w:color="BFBFBF" w:sz="4"/>
-              <w:bottom w:val="single" w:color="BFBFBF" w:sz="4"/>
-              <w:right w:val="single" w:color="BFBFBF" w:sz="4"/>
-            </w:tcBorders>
-            <w:tcMar>
-              <w:top w:type="dxa" w:w="70"/>
-              <w:left w:type="dxa" w:w="110"/>
-              <w:bottom w:type="dxa" w:w="70"/>
-              <w:right w:type="dxa" w:w="110"/>
-            </w:tcMar>
-            <w:vAlign w:val="top"/>
-          </w:tcPr>
-          <w:p>
+            <w:tcW w:type="dxa" w:w="1500"/>
+            <w:vMerge w:val="restart"/>
+            <w:tcBorders>
+              <w:top w:val="single" w:color="BFBFBF" w:sz="4"/>
+              <w:left w:val="single" w:color="BFBFBF" w:sz="4"/>
+              <w:bottom w:val="single" w:color="BFBFBF" w:sz="4"/>
+              <w:right w:val="single" w:color="BFBFBF" w:sz="4"/>
+            </w:tcBorders>
+            <w:tcMar>
+              <w:top w:type="dxa" w:w="70"/>
+              <w:left w:type="dxa" w:w="110"/>
+              <w:bottom w:type="dxa" w:w="70"/>
+              <w:right w:type="dxa" w:w="110"/>
+            </w:tcMar>
+            <w:vAlign w:val="center"/>
+          </w:tcPr>
+          <w:p>
+            <w:pPr>
+              <w:jc w:val="center"/>
+            </w:pPr>
             <w:r>
               <w:rPr>
                 <w:rFonts w:ascii="Calibri" w:cs="Calibri" w:eastAsia="Calibri" w:hAnsi="Calibri"/>
@@ -4991,7 +4755,37 @@
                 <w:sz w:val="19"/>
                 <w:szCs w:val="19"/>
               </w:rPr>
-              <w:t xml:space="preserve">Baphakamise</w:t>
+              <w:t xml:space="preserve">Tue 27 Oct</w:t>
+            </w:r>
+          </w:p>
+        </w:tc>
+        <w:tc>
+          <w:tcPr>
+            <w:tcW w:type="dxa" w:w="1700"/>
+            <w:tcBorders>
+              <w:top w:val="single" w:color="BFBFBF" w:sz="4"/>
+              <w:left w:val="single" w:color="BFBFBF" w:sz="4"/>
+              <w:bottom w:val="single" w:color="BFBFBF" w:sz="4"/>
+              <w:right w:val="single" w:color="BFBFBF" w:sz="4"/>
+            </w:tcBorders>
+            <w:tcMar>
+              <w:top w:type="dxa" w:w="70"/>
+              <w:left w:type="dxa" w:w="110"/>
+              <w:bottom w:type="dxa" w:w="70"/>
+              <w:right w:type="dxa" w:w="110"/>
+            </w:tcMar>
+            <w:vAlign w:val="top"/>
+          </w:tcPr>
+          <w:p>
+            <w:r>
+              <w:rPr>
+                <w:rFonts w:ascii="Calibri" w:cs="Calibri" w:eastAsia="Calibri" w:hAnsi="Calibri"/>
+                <w:b/>
+                <w:bCs/>
+                <w:sz w:val="19"/>
+                <w:szCs w:val="19"/>
+              </w:rPr>
+              <w:t xml:space="preserve">Samukelo</w:t>
             </w:r>
           </w:p>
         </w:tc>
@@ -5021,19 +4815,7 @@
                 <w:sz w:val="19"/>
                 <w:szCs w:val="19"/>
               </w:rPr>
-              <w:t xml:space="preserve">S1-18 · As an agent, I want to review and edit the AI draft before sending, so that I stay in control of what goes out. </w:t>
-            </w:r>
-            <w:r>
-              <w:rPr>
-                <w:rFonts w:ascii="Calibri" w:cs="Calibri" w:eastAsia="Calibri" w:hAnsi="Calibri"/>
-                <w:b w:val="false"/>
-                <w:bCs w:val="false"/>
-                <w:i/>
-                <w:iCs/>
-                <w:sz w:val="19"/>
-                <w:szCs w:val="19"/>
-              </w:rPr>
-              <w:t xml:space="preserve">(part 1)</w:t>
+              <w:t xml:space="preserve">S1-20 · As a CAPACITI assessor, I want a diagram and description of Relay's parts, so that I understand how it is built without reading the code.</w:t>
             </w:r>
           </w:p>
         </w:tc>
@@ -5063,7 +4845,7 @@
                 <w:sz w:val="19"/>
                 <w:szCs w:val="19"/>
               </w:rPr>
-              <w:t xml:space="preserve">Draft shown with an "AI-drafted" label; agent can edit before sending; sending sets the ticket to answered and records the time</w:t>
+              <w:t xml:space="preserve">Architecture diagram; each component and why it was chosen; data model</w:t>
             </w:r>
           </w:p>
         </w:tc>
@@ -5104,27 +4886,34 @@
         </w:trPr>
         <w:tc>
           <w:tcPr>
-            <w:tcW w:type="dxa" w:w="1500"/>
-            <w:vMerge w:val="restart"/>
-            <w:tcBorders>
-              <w:top w:val="single" w:color="BFBFBF" w:sz="4"/>
-              <w:left w:val="single" w:color="BFBFBF" w:sz="4"/>
-              <w:bottom w:val="single" w:color="BFBFBF" w:sz="4"/>
-              <w:right w:val="single" w:color="BFBFBF" w:sz="4"/>
-            </w:tcBorders>
-            <w:shd w:fill="F0EFEC" w:color="auto" w:val="clear"/>
-            <w:tcMar>
-              <w:top w:type="dxa" w:w="70"/>
-              <w:left w:type="dxa" w:w="110"/>
-              <w:bottom w:type="dxa" w:w="70"/>
-              <w:right w:type="dxa" w:w="110"/>
-            </w:tcMar>
-            <w:vAlign w:val="center"/>
-          </w:tcPr>
-          <w:p>
-            <w:pPr>
-              <w:jc w:val="center"/>
-            </w:pPr>
+            <w:vMerge w:val="continue"/>
+            <w:tcBorders>
+              <w:top w:val="single" w:color="BFBFBF" w:sz="4"/>
+              <w:left w:val="single" w:color="BFBFBF" w:sz="4"/>
+              <w:bottom w:val="single" w:color="BFBFBF" w:sz="4"/>
+              <w:right w:val="single" w:color="BFBFBF" w:sz="4"/>
+            </w:tcBorders>
+          </w:tcPr>
+          <w:p/>
+        </w:tc>
+        <w:tc>
+          <w:tcPr>
+            <w:tcW w:type="dxa" w:w="1700"/>
+            <w:tcBorders>
+              <w:top w:val="single" w:color="BFBFBF" w:sz="4"/>
+              <w:left w:val="single" w:color="BFBFBF" w:sz="4"/>
+              <w:bottom w:val="single" w:color="BFBFBF" w:sz="4"/>
+              <w:right w:val="single" w:color="BFBFBF" w:sz="4"/>
+            </w:tcBorders>
+            <w:tcMar>
+              <w:top w:type="dxa" w:w="70"/>
+              <w:left w:type="dxa" w:w="110"/>
+              <w:bottom w:type="dxa" w:w="70"/>
+              <w:right w:type="dxa" w:w="110"/>
+            </w:tcMar>
+            <w:vAlign w:val="top"/>
+          </w:tcPr>
+          <w:p>
             <w:r>
               <w:rPr>
                 <w:rFonts w:ascii="Calibri" w:cs="Calibri" w:eastAsia="Calibri" w:hAnsi="Calibri"/>
@@ -5133,38 +4922,7 @@
                 <w:sz w:val="19"/>
                 <w:szCs w:val="19"/>
               </w:rPr>
-              <w:t xml:space="preserve">Wed 28 Oct</w:t>
-            </w:r>
-          </w:p>
-        </w:tc>
-        <w:tc>
-          <w:tcPr>
-            <w:tcW w:type="dxa" w:w="1700"/>
-            <w:tcBorders>
-              <w:top w:val="single" w:color="BFBFBF" w:sz="4"/>
-              <w:left w:val="single" w:color="BFBFBF" w:sz="4"/>
-              <w:bottom w:val="single" w:color="BFBFBF" w:sz="4"/>
-              <w:right w:val="single" w:color="BFBFBF" w:sz="4"/>
-            </w:tcBorders>
-            <w:shd w:fill="F0EFEC" w:color="auto" w:val="clear"/>
-            <w:tcMar>
-              <w:top w:type="dxa" w:w="70"/>
-              <w:left w:type="dxa" w:w="110"/>
-              <w:bottom w:type="dxa" w:w="70"/>
-              <w:right w:type="dxa" w:w="110"/>
-            </w:tcMar>
-            <w:vAlign w:val="top"/>
-          </w:tcPr>
-          <w:p>
-            <w:r>
-              <w:rPr>
-                <w:rFonts w:ascii="Calibri" w:cs="Calibri" w:eastAsia="Calibri" w:hAnsi="Calibri"/>
-                <w:b/>
-                <w:bCs/>
-                <w:sz w:val="19"/>
-                <w:szCs w:val="19"/>
-              </w:rPr>
-              <w:t xml:space="preserve">Samukelo</w:t>
+              <w:t xml:space="preserve">Elzel</w:t>
             </w:r>
           </w:p>
         </w:tc>
@@ -5177,37 +4935,24 @@
               <w:bottom w:val="single" w:color="BFBFBF" w:sz="4"/>
               <w:right w:val="single" w:color="BFBFBF" w:sz="4"/>
             </w:tcBorders>
-            <w:shd w:fill="F0EFEC" w:color="auto" w:val="clear"/>
-            <w:tcMar>
-              <w:top w:type="dxa" w:w="70"/>
-              <w:left w:type="dxa" w:w="110"/>
-              <w:bottom w:type="dxa" w:w="70"/>
-              <w:right w:type="dxa" w:w="110"/>
-            </w:tcMar>
-            <w:vAlign w:val="top"/>
-          </w:tcPr>
-          <w:p>
-            <w:r>
-              <w:rPr>
-                <w:rFonts w:ascii="Calibri" w:cs="Calibri" w:eastAsia="Calibri" w:hAnsi="Calibri"/>
-                <w:b w:val="false"/>
-                <w:bCs w:val="false"/>
-                <w:sz w:val="19"/>
-                <w:szCs w:val="19"/>
-              </w:rPr>
-              <w:t xml:space="preserve">S1-04 · Architecture document </w:t>
-            </w:r>
-            <w:r>
-              <w:rPr>
-                <w:rFonts w:ascii="Calibri" w:cs="Calibri" w:eastAsia="Calibri" w:hAnsi="Calibri"/>
-                <w:b w:val="false"/>
-                <w:bCs w:val="false"/>
-                <w:i/>
-                <w:iCs/>
-                <w:sz w:val="19"/>
-                <w:szCs w:val="19"/>
-              </w:rPr>
-              <w:t xml:space="preserve">(part 2)</w:t>
+            <w:tcMar>
+              <w:top w:type="dxa" w:w="70"/>
+              <w:left w:type="dxa" w:w="110"/>
+              <w:bottom w:type="dxa" w:w="70"/>
+              <w:right w:type="dxa" w:w="110"/>
+            </w:tcMar>
+            <w:vAlign w:val="top"/>
+          </w:tcPr>
+          <w:p>
+            <w:r>
+              <w:rPr>
+                <w:rFonts w:ascii="Calibri" w:cs="Calibri" w:eastAsia="Calibri" w:hAnsi="Calibri"/>
+                <w:b w:val="false"/>
+                <w:bCs w:val="false"/>
+                <w:sz w:val="19"/>
+                <w:szCs w:val="19"/>
+              </w:rPr>
+              <w:t xml:space="preserve">S1-21 · As a staff member, I want my request sent to the right department automatically, so that I don't need to know who handles what.</w:t>
             </w:r>
           </w:p>
         </w:tc>
@@ -5220,25 +4965,24 @@
               <w:bottom w:val="single" w:color="BFBFBF" w:sz="4"/>
               <w:right w:val="single" w:color="BFBFBF" w:sz="4"/>
             </w:tcBorders>
-            <w:shd w:fill="F0EFEC" w:color="auto" w:val="clear"/>
-            <w:tcMar>
-              <w:top w:type="dxa" w:w="70"/>
-              <w:left w:type="dxa" w:w="110"/>
-              <w:bottom w:type="dxa" w:w="70"/>
-              <w:right w:type="dxa" w:w="110"/>
-            </w:tcMar>
-            <w:vAlign w:val="top"/>
-          </w:tcPr>
-          <w:p>
-            <w:r>
-              <w:rPr>
-                <w:rFonts w:ascii="Calibri" w:cs="Calibri" w:eastAsia="Calibri" w:hAnsi="Calibri"/>
-                <w:b w:val="false"/>
-                <w:bCs w:val="false"/>
-                <w:sz w:val="19"/>
-                <w:szCs w:val="19"/>
-              </w:rPr>
-              <w:t xml:space="preserve">Request flow from submit to reply; how the design supports the later sprints; security and roles; saved in /docs</w:t>
+            <w:tcMar>
+              <w:top w:type="dxa" w:w="70"/>
+              <w:left w:type="dxa" w:w="110"/>
+              <w:bottom w:type="dxa" w:w="70"/>
+              <w:right w:type="dxa" w:w="110"/>
+            </w:tcMar>
+            <w:vAlign w:val="top"/>
+          </w:tcPr>
+          <w:p>
+            <w:r>
+              <w:rPr>
+                <w:rFonts w:ascii="Calibri" w:cs="Calibri" w:eastAsia="Calibri" w:hAnsi="Calibri"/>
+                <w:b w:val="false"/>
+                <w:bCs w:val="false"/>
+                <w:sz w:val="19"/>
+                <w:szCs w:val="19"/>
+              </w:rPr>
+              <w:t xml:space="preserve">The test version of /api/classify replaced by the real model; returns department and confidence in under one second; result saved to classifications with the model version</w:t>
             </w:r>
           </w:p>
         </w:tc>
@@ -5251,7 +4995,6 @@
               <w:bottom w:val="single" w:color="BFBFBF" w:sz="4"/>
               <w:right w:val="single" w:color="BFBFBF" w:sz="4"/>
             </w:tcBorders>
-            <w:shd w:fill="F0EFEC" w:color="auto" w:val="clear"/>
             <w:tcMar>
               <w:top w:type="dxa" w:w="70"/>
               <w:left w:type="dxa" w:w="110"/>
@@ -5299,7 +5042,6 @@
               <w:bottom w:val="single" w:color="BFBFBF" w:sz="4"/>
               <w:right w:val="single" w:color="BFBFBF" w:sz="4"/>
             </w:tcBorders>
-            <w:shd w:fill="F0EFEC" w:color="auto" w:val="clear"/>
             <w:tcMar>
               <w:top w:type="dxa" w:w="70"/>
               <w:left w:type="dxa" w:w="110"/>
@@ -5317,7 +5059,7 @@
                 <w:sz w:val="19"/>
                 <w:szCs w:val="19"/>
               </w:rPr>
-              <w:t xml:space="preserve">Elzel</w:t>
+              <w:t xml:space="preserve">Mihlali</w:t>
             </w:r>
           </w:p>
         </w:tc>
@@ -5330,25 +5072,24 @@
               <w:bottom w:val="single" w:color="BFBFBF" w:sz="4"/>
               <w:right w:val="single" w:color="BFBFBF" w:sz="4"/>
             </w:tcBorders>
-            <w:shd w:fill="F0EFEC" w:color="auto" w:val="clear"/>
-            <w:tcMar>
-              <w:top w:type="dxa" w:w="70"/>
-              <w:left w:type="dxa" w:w="110"/>
-              <w:bottom w:type="dxa" w:w="70"/>
-              <w:right w:type="dxa" w:w="110"/>
-            </w:tcMar>
-            <w:vAlign w:val="top"/>
-          </w:tcPr>
-          <w:p>
-            <w:r>
-              <w:rPr>
-                <w:rFonts w:ascii="Calibri" w:cs="Calibri" w:eastAsia="Calibri" w:hAnsi="Calibri"/>
-                <w:b w:val="false"/>
-                <w:bCs w:val="false"/>
-                <w:sz w:val="19"/>
-                <w:szCs w:val="19"/>
-              </w:rPr>
-              <w:t xml:space="preserve">S1-08 · As an agent, I want unsure classifications flagged, so that wrongly routed tickets are caught.</w:t>
+            <w:tcMar>
+              <w:top w:type="dxa" w:w="70"/>
+              <w:left w:type="dxa" w:w="110"/>
+              <w:bottom w:type="dxa" w:w="70"/>
+              <w:right w:type="dxa" w:w="110"/>
+            </w:tcMar>
+            <w:vAlign w:val="top"/>
+          </w:tcPr>
+          <w:p>
+            <w:r>
+              <w:rPr>
+                <w:rFonts w:ascii="Calibri" w:cs="Calibri" w:eastAsia="Calibri" w:hAnsi="Calibri"/>
+                <w:b w:val="false"/>
+                <w:bCs w:val="false"/>
+                <w:sz w:val="19"/>
+                <w:szCs w:val="19"/>
+              </w:rPr>
+              <w:t xml:space="preserve">S1-22 · As a driver, I want to submit a request from my phone, so that I can get help without calling the office.</w:t>
             </w:r>
           </w:p>
         </w:tc>
@@ -5361,25 +5102,24 @@
               <w:bottom w:val="single" w:color="BFBFBF" w:sz="4"/>
               <w:right w:val="single" w:color="BFBFBF" w:sz="4"/>
             </w:tcBorders>
-            <w:shd w:fill="F0EFEC" w:color="auto" w:val="clear"/>
-            <w:tcMar>
-              <w:top w:type="dxa" w:w="70"/>
-              <w:left w:type="dxa" w:w="110"/>
-              <w:bottom w:type="dxa" w:w="70"/>
-              <w:right w:type="dxa" w:w="110"/>
-            </w:tcMar>
-            <w:vAlign w:val="top"/>
-          </w:tcPr>
-          <w:p>
-            <w:r>
-              <w:rPr>
-                <w:rFonts w:ascii="Calibri" w:cs="Calibri" w:eastAsia="Calibri" w:hAnsi="Calibri"/>
-                <w:b w:val="false"/>
-                <w:bCs w:val="false"/>
-                <w:sz w:val="19"/>
-                <w:szCs w:val="19"/>
-              </w:rPr>
-              <w:t xml:space="preserve">Tickets below 0.6 confidence marked "Needs review"; agent can change the category; every change saved with who and when</w:t>
+            <w:tcMar>
+              <w:top w:type="dxa" w:w="70"/>
+              <w:left w:type="dxa" w:w="110"/>
+              <w:bottom w:type="dxa" w:w="70"/>
+              <w:right w:type="dxa" w:w="110"/>
+            </w:tcMar>
+            <w:vAlign w:val="top"/>
+          </w:tcPr>
+          <w:p>
+            <w:r>
+              <w:rPr>
+                <w:rFonts w:ascii="Calibri" w:cs="Calibri" w:eastAsia="Calibri" w:hAnsi="Calibri"/>
+                <w:b w:val="false"/>
+                <w:bCs w:val="false"/>
+                <w:sz w:val="19"/>
+                <w:szCs w:val="19"/>
+              </w:rPr>
+              <w:t xml:space="preserve">Subject, description and depot fields, all labelled; works on a 360px-wide screen; clear error messages; after submitting, shows a reference number and the department it went to</w:t>
             </w:r>
           </w:p>
         </w:tc>
@@ -5392,7 +5132,6 @@
               <w:bottom w:val="single" w:color="BFBFBF" w:sz="4"/>
               <w:right w:val="single" w:color="BFBFBF" w:sz="4"/>
             </w:tcBorders>
-            <w:shd w:fill="F0EFEC" w:color="auto" w:val="clear"/>
             <w:tcMar>
               <w:top w:type="dxa" w:w="70"/>
               <w:left w:type="dxa" w:w="110"/>
@@ -5440,7 +5179,6 @@
               <w:bottom w:val="single" w:color="BFBFBF" w:sz="4"/>
               <w:right w:val="single" w:color="BFBFBF" w:sz="4"/>
             </w:tcBorders>
-            <w:shd w:fill="F0EFEC" w:color="auto" w:val="clear"/>
             <w:tcMar>
               <w:top w:type="dxa" w:w="70"/>
               <w:left w:type="dxa" w:w="110"/>
@@ -5458,7 +5196,7 @@
                 <w:sz w:val="19"/>
                 <w:szCs w:val="19"/>
               </w:rPr>
-              <w:t xml:space="preserve">Mihlali</w:t>
+              <w:t xml:space="preserve">Baphakamise</w:t>
             </w:r>
           </w:p>
         </w:tc>
@@ -5471,25 +5209,24 @@
               <w:bottom w:val="single" w:color="BFBFBF" w:sz="4"/>
               <w:right w:val="single" w:color="BFBFBF" w:sz="4"/>
             </w:tcBorders>
-            <w:shd w:fill="F0EFEC" w:color="auto" w:val="clear"/>
-            <w:tcMar>
-              <w:top w:type="dxa" w:w="70"/>
-              <w:left w:type="dxa" w:w="110"/>
-              <w:bottom w:type="dxa" w:w="70"/>
-              <w:right w:type="dxa" w:w="110"/>
-            </w:tcMar>
-            <w:vAlign w:val="top"/>
-          </w:tcPr>
-          <w:p>
-            <w:r>
-              <w:rPr>
-                <w:rFonts w:ascii="Calibri" w:cs="Calibri" w:eastAsia="Calibri" w:hAnsi="Calibri"/>
-                <w:b w:val="false"/>
-                <w:bCs w:val="false"/>
-                <w:sz w:val="19"/>
-                <w:szCs w:val="19"/>
-              </w:rPr>
-              <w:t xml:space="preserve">S1-13 · As a staff member, I want to see my requests and their status, so that I don't have to chase anyone on WhatsApp.</w:t>
+            <w:tcMar>
+              <w:top w:type="dxa" w:w="70"/>
+              <w:left w:type="dxa" w:w="110"/>
+              <w:bottom w:type="dxa" w:w="70"/>
+              <w:right w:type="dxa" w:w="110"/>
+            </w:tcMar>
+            <w:vAlign w:val="top"/>
+          </w:tcPr>
+          <w:p>
+            <w:r>
+              <w:rPr>
+                <w:rFonts w:ascii="Calibri" w:cs="Calibri" w:eastAsia="Calibri" w:hAnsi="Calibri"/>
+                <w:b w:val="false"/>
+                <w:bCs w:val="false"/>
+                <w:sz w:val="19"/>
+                <w:szCs w:val="19"/>
+              </w:rPr>
+              <w:t xml:space="preserve">S1-23 · As an agent, I want to edit the AI draft and then send it, so that I stay in control of what goes out.</w:t>
             </w:r>
           </w:p>
         </w:tc>
@@ -5502,25 +5239,24 @@
               <w:bottom w:val="single" w:color="BFBFBF" w:sz="4"/>
               <w:right w:val="single" w:color="BFBFBF" w:sz="4"/>
             </w:tcBorders>
-            <w:shd w:fill="F0EFEC" w:color="auto" w:val="clear"/>
-            <w:tcMar>
-              <w:top w:type="dxa" w:w="70"/>
-              <w:left w:type="dxa" w:w="110"/>
-              <w:bottom w:type="dxa" w:w="70"/>
-              <w:right w:type="dxa" w:w="110"/>
-            </w:tcMar>
-            <w:vAlign w:val="top"/>
-          </w:tcPr>
-          <w:p>
-            <w:r>
-              <w:rPr>
-                <w:rFonts w:ascii="Calibri" w:cs="Calibri" w:eastAsia="Calibri" w:hAnsi="Calibri"/>
-                <w:b w:val="false"/>
-                <w:bCs w:val="false"/>
-                <w:sz w:val="19"/>
-                <w:szCs w:val="19"/>
-              </w:rPr>
-              <w:t xml:space="preserve">My requests list, newest first; status in words and colour; detail page shows department, status history and the reply once sent</w:t>
+            <w:tcMar>
+              <w:top w:type="dxa" w:w="70"/>
+              <w:left w:type="dxa" w:w="110"/>
+              <w:bottom w:type="dxa" w:w="70"/>
+              <w:right w:type="dxa" w:w="110"/>
+            </w:tcMar>
+            <w:vAlign w:val="top"/>
+          </w:tcPr>
+          <w:p>
+            <w:r>
+              <w:rPr>
+                <w:rFonts w:ascii="Calibri" w:cs="Calibri" w:eastAsia="Calibri" w:hAnsi="Calibri"/>
+                <w:b w:val="false"/>
+                <w:bCs w:val="false"/>
+                <w:sz w:val="19"/>
+                <w:szCs w:val="19"/>
+              </w:rPr>
+              <w:t xml:space="preserve">Draft shown with an "AI-drafted" label; agent can edit it; sending sets the ticket to answered and records the time</w:t>
             </w:r>
           </w:p>
         </w:tc>
@@ -5533,7 +5269,6 @@
               <w:bottom w:val="single" w:color="BFBFBF" w:sz="4"/>
               <w:right w:val="single" w:color="BFBFBF" w:sz="4"/>
             </w:tcBorders>
-            <w:shd w:fill="F0EFEC" w:color="auto" w:val="clear"/>
             <w:tcMar>
               <w:top w:type="dxa" w:w="70"/>
               <w:left w:type="dxa" w:w="110"/>
@@ -5562,35 +5297,27 @@
         </w:trPr>
         <w:tc>
           <w:tcPr>
-            <w:vMerge w:val="continue"/>
-            <w:tcBorders>
-              <w:top w:val="single" w:color="BFBFBF" w:sz="4"/>
-              <w:left w:val="single" w:color="BFBFBF" w:sz="4"/>
-              <w:bottom w:val="single" w:color="BFBFBF" w:sz="4"/>
-              <w:right w:val="single" w:color="BFBFBF" w:sz="4"/>
-            </w:tcBorders>
-          </w:tcPr>
-          <w:p/>
-        </w:tc>
-        <w:tc>
-          <w:tcPr>
-            <w:tcW w:type="dxa" w:w="1700"/>
-            <w:tcBorders>
-              <w:top w:val="single" w:color="BFBFBF" w:sz="4"/>
-              <w:left w:val="single" w:color="BFBFBF" w:sz="4"/>
-              <w:bottom w:val="single" w:color="BFBFBF" w:sz="4"/>
-              <w:right w:val="single" w:color="BFBFBF" w:sz="4"/>
-            </w:tcBorders>
-            <w:shd w:fill="F0EFEC" w:color="auto" w:val="clear"/>
-            <w:tcMar>
-              <w:top w:type="dxa" w:w="70"/>
-              <w:left w:type="dxa" w:w="110"/>
-              <w:bottom w:type="dxa" w:w="70"/>
-              <w:right w:type="dxa" w:w="110"/>
-            </w:tcMar>
-            <w:vAlign w:val="top"/>
-          </w:tcPr>
-          <w:p>
+            <w:tcW w:type="dxa" w:w="1500"/>
+            <w:vMerge w:val="restart"/>
+            <w:tcBorders>
+              <w:top w:val="single" w:color="BFBFBF" w:sz="4"/>
+              <w:left w:val="single" w:color="BFBFBF" w:sz="4"/>
+              <w:bottom w:val="single" w:color="BFBFBF" w:sz="4"/>
+              <w:right w:val="single" w:color="BFBFBF" w:sz="4"/>
+            </w:tcBorders>
+            <w:shd w:fill="F0EFEC" w:color="auto" w:val="clear"/>
+            <w:tcMar>
+              <w:top w:type="dxa" w:w="70"/>
+              <w:left w:type="dxa" w:w="110"/>
+              <w:bottom w:type="dxa" w:w="70"/>
+              <w:right w:type="dxa" w:w="110"/>
+            </w:tcMar>
+            <w:vAlign w:val="center"/>
+          </w:tcPr>
+          <w:p>
+            <w:pPr>
+              <w:jc w:val="center"/>
+            </w:pPr>
             <w:r>
               <w:rPr>
                 <w:rFonts w:ascii="Calibri" w:cs="Calibri" w:eastAsia="Calibri" w:hAnsi="Calibri"/>
@@ -5599,7 +5326,38 @@
                 <w:sz w:val="19"/>
                 <w:szCs w:val="19"/>
               </w:rPr>
-              <w:t xml:space="preserve">Baphakamise</w:t>
+              <w:t xml:space="preserve">Wed 28 Oct</w:t>
+            </w:r>
+          </w:p>
+        </w:tc>
+        <w:tc>
+          <w:tcPr>
+            <w:tcW w:type="dxa" w:w="1700"/>
+            <w:tcBorders>
+              <w:top w:val="single" w:color="BFBFBF" w:sz="4"/>
+              <w:left w:val="single" w:color="BFBFBF" w:sz="4"/>
+              <w:bottom w:val="single" w:color="BFBFBF" w:sz="4"/>
+              <w:right w:val="single" w:color="BFBFBF" w:sz="4"/>
+            </w:tcBorders>
+            <w:shd w:fill="F0EFEC" w:color="auto" w:val="clear"/>
+            <w:tcMar>
+              <w:top w:type="dxa" w:w="70"/>
+              <w:left w:type="dxa" w:w="110"/>
+              <w:bottom w:type="dxa" w:w="70"/>
+              <w:right w:type="dxa" w:w="110"/>
+            </w:tcMar>
+            <w:vAlign w:val="top"/>
+          </w:tcPr>
+          <w:p>
+            <w:r>
+              <w:rPr>
+                <w:rFonts w:ascii="Calibri" w:cs="Calibri" w:eastAsia="Calibri" w:hAnsi="Calibri"/>
+                <w:b/>
+                <w:bCs/>
+                <w:sz w:val="19"/>
+                <w:szCs w:val="19"/>
+              </w:rPr>
+              <w:t xml:space="preserve">Samukelo</w:t>
             </w:r>
           </w:p>
         </w:tc>
@@ -5630,41 +5388,7 @@
                 <w:sz w:val="19"/>
                 <w:szCs w:val="19"/>
               </w:rPr>
-              <w:t xml:space="preserve">S1-15 · Templates </w:t>
-            </w:r>
-            <w:r>
-              <w:rPr>
-                <w:rFonts w:ascii="Calibri" w:cs="Calibri" w:eastAsia="Calibri" w:hAnsi="Calibri"/>
-                <w:b w:val="false"/>
-                <w:bCs w:val="false"/>
-                <w:i/>
-                <w:iCs/>
-                <w:sz w:val="19"/>
-                <w:szCs w:val="19"/>
-              </w:rPr>
-              <w:t xml:space="preserve">(part 2)</w:t>
-            </w:r>
-            <w:r>
-              <w:rPr>
-                <w:rFonts w:ascii="Calibri" w:cs="Calibri" w:eastAsia="Calibri" w:hAnsi="Calibri"/>
-                <w:b w:val="false"/>
-                <w:bCs w:val="false"/>
-                <w:sz w:val="19"/>
-                <w:szCs w:val="19"/>
-              </w:rPr>
-              <w:t xml:space="preserve"> and S1-18 · Review and send </w:t>
-            </w:r>
-            <w:r>
-              <w:rPr>
-                <w:rFonts w:ascii="Calibri" w:cs="Calibri" w:eastAsia="Calibri" w:hAnsi="Calibri"/>
-                <w:b w:val="false"/>
-                <w:bCs w:val="false"/>
-                <w:i/>
-                <w:iCs/>
-                <w:sz w:val="19"/>
-                <w:szCs w:val="19"/>
-              </w:rPr>
-              <w:t xml:space="preserve">(part 2)</w:t>
+              <w:t xml:space="preserve">S1-24 · As a new team member, I want the request flow, security and future plans written down, so that I understand how a ticket moves through Relay and how it will grow.</w:t>
             </w:r>
           </w:p>
         </w:tc>
@@ -5695,7 +5419,7 @@
                 <w:sz w:val="19"/>
                 <w:szCs w:val="19"/>
               </w:rPr>
-              <w:t xml:space="preserve">Template library screen to view and edit templates; staff member sees the sent reply on their request (tested with Mihlali)</w:t>
+              <w:t xml:space="preserve">Request flow from submit to reply; roles and security; how the design supports the later sprints; saved in /docs</w:t>
             </w:r>
           </w:p>
         </w:tc>
@@ -5737,25 +5461,35 @@
         </w:trPr>
         <w:tc>
           <w:tcPr>
-            <w:tcW w:type="dxa" w:w="1500"/>
-            <w:tcBorders>
-              <w:top w:val="single" w:color="BFBFBF" w:sz="4"/>
-              <w:left w:val="single" w:color="BFBFBF" w:sz="4"/>
-              <w:bottom w:val="single" w:color="BFBFBF" w:sz="4"/>
-              <w:right w:val="single" w:color="BFBFBF" w:sz="4"/>
-            </w:tcBorders>
-            <w:tcMar>
-              <w:top w:type="dxa" w:w="70"/>
-              <w:left w:type="dxa" w:w="110"/>
-              <w:bottom w:type="dxa" w:w="70"/>
-              <w:right w:type="dxa" w:w="110"/>
-            </w:tcMar>
-            <w:vAlign w:val="center"/>
-          </w:tcPr>
-          <w:p>
-            <w:pPr>
-              <w:jc w:val="center"/>
-            </w:pPr>
+            <w:vMerge w:val="continue"/>
+            <w:tcBorders>
+              <w:top w:val="single" w:color="BFBFBF" w:sz="4"/>
+              <w:left w:val="single" w:color="BFBFBF" w:sz="4"/>
+              <w:bottom w:val="single" w:color="BFBFBF" w:sz="4"/>
+              <w:right w:val="single" w:color="BFBFBF" w:sz="4"/>
+            </w:tcBorders>
+          </w:tcPr>
+          <w:p/>
+        </w:tc>
+        <w:tc>
+          <w:tcPr>
+            <w:tcW w:type="dxa" w:w="1700"/>
+            <w:tcBorders>
+              <w:top w:val="single" w:color="BFBFBF" w:sz="4"/>
+              <w:left w:val="single" w:color="BFBFBF" w:sz="4"/>
+              <w:bottom w:val="single" w:color="BFBFBF" w:sz="4"/>
+              <w:right w:val="single" w:color="BFBFBF" w:sz="4"/>
+            </w:tcBorders>
+            <w:shd w:fill="F0EFEC" w:color="auto" w:val="clear"/>
+            <w:tcMar>
+              <w:top w:type="dxa" w:w="70"/>
+              <w:left w:type="dxa" w:w="110"/>
+              <w:bottom w:type="dxa" w:w="70"/>
+              <w:right w:type="dxa" w:w="110"/>
+            </w:tcMar>
+            <w:vAlign w:val="top"/>
+          </w:tcPr>
+          <w:p>
             <w:r>
               <w:rPr>
                 <w:rFonts w:ascii="Calibri" w:cs="Calibri" w:eastAsia="Calibri" w:hAnsi="Calibri"/>
@@ -5764,37 +5498,7 @@
                 <w:sz w:val="19"/>
                 <w:szCs w:val="19"/>
               </w:rPr>
-              <w:t xml:space="preserve">Thu 29 Oct</w:t>
-            </w:r>
-          </w:p>
-        </w:tc>
-        <w:tc>
-          <w:tcPr>
-            <w:tcW w:type="dxa" w:w="1700"/>
-            <w:tcBorders>
-              <w:top w:val="single" w:color="BFBFBF" w:sz="4"/>
-              <w:left w:val="single" w:color="BFBFBF" w:sz="4"/>
-              <w:bottom w:val="single" w:color="BFBFBF" w:sz="4"/>
-              <w:right w:val="single" w:color="BFBFBF" w:sz="4"/>
-            </w:tcBorders>
-            <w:tcMar>
-              <w:top w:type="dxa" w:w="70"/>
-              <w:left w:type="dxa" w:w="110"/>
-              <w:bottom w:type="dxa" w:w="70"/>
-              <w:right w:type="dxa" w:w="110"/>
-            </w:tcMar>
-            <w:vAlign w:val="top"/>
-          </w:tcPr>
-          <w:p>
-            <w:r>
-              <w:rPr>
-                <w:rFonts w:ascii="Calibri" w:cs="Calibri" w:eastAsia="Calibri" w:hAnsi="Calibri"/>
-                <w:b/>
-                <w:bCs/>
-                <w:sz w:val="19"/>
-                <w:szCs w:val="19"/>
-              </w:rPr>
-              <w:t xml:space="preserve">All members</w:t>
+              <w:t xml:space="preserve">Elzel</w:t>
             </w:r>
           </w:p>
         </w:tc>
@@ -5807,24 +5511,25 @@
               <w:bottom w:val="single" w:color="BFBFBF" w:sz="4"/>
               <w:right w:val="single" w:color="BFBFBF" w:sz="4"/>
             </w:tcBorders>
-            <w:tcMar>
-              <w:top w:type="dxa" w:w="70"/>
-              <w:left w:type="dxa" w:w="110"/>
-              <w:bottom w:type="dxa" w:w="70"/>
-              <w:right w:type="dxa" w:w="110"/>
-            </w:tcMar>
-            <w:vAlign w:val="top"/>
-          </w:tcPr>
-          <w:p>
-            <w:r>
-              <w:rPr>
-                <w:rFonts w:ascii="Calibri" w:cs="Calibri" w:eastAsia="Calibri" w:hAnsi="Calibri"/>
-                <w:b w:val="false"/>
-                <w:bCs w:val="false"/>
-                <w:sz w:val="19"/>
-                <w:szCs w:val="19"/>
-              </w:rPr>
-              <w:t xml:space="preserve">Integration test and bug fixing</w:t>
+            <w:shd w:fill="F0EFEC" w:color="auto" w:val="clear"/>
+            <w:tcMar>
+              <w:top w:type="dxa" w:w="70"/>
+              <w:left w:type="dxa" w:w="110"/>
+              <w:bottom w:type="dxa" w:w="70"/>
+              <w:right w:type="dxa" w:w="110"/>
+            </w:tcMar>
+            <w:vAlign w:val="top"/>
+          </w:tcPr>
+          <w:p>
+            <w:r>
+              <w:rPr>
+                <w:rFonts w:ascii="Calibri" w:cs="Calibri" w:eastAsia="Calibri" w:hAnsi="Calibri"/>
+                <w:b w:val="false"/>
+                <w:bCs w:val="false"/>
+                <w:sz w:val="19"/>
+                <w:szCs w:val="19"/>
+              </w:rPr>
+              <w:t xml:space="preserve">S1-25 · As an agent, I want unsure classifications flagged, so that wrongly routed tickets are caught.</w:t>
             </w:r>
           </w:p>
         </w:tc>
@@ -5837,24 +5542,25 @@
               <w:bottom w:val="single" w:color="BFBFBF" w:sz="4"/>
               <w:right w:val="single" w:color="BFBFBF" w:sz="4"/>
             </w:tcBorders>
-            <w:tcMar>
-              <w:top w:type="dxa" w:w="70"/>
-              <w:left w:type="dxa" w:w="110"/>
-              <w:bottom w:type="dxa" w:w="70"/>
-              <w:right w:type="dxa" w:w="110"/>
-            </w:tcMar>
-            <w:vAlign w:val="top"/>
-          </w:tcPr>
-          <w:p>
-            <w:r>
-              <w:rPr>
-                <w:rFonts w:ascii="Calibri" w:cs="Calibri" w:eastAsia="Calibri" w:hAnsi="Calibri"/>
-                <w:b w:val="false"/>
-                <w:bCs w:val="false"/>
-                <w:sz w:val="19"/>
-                <w:szCs w:val="19"/>
-              </w:rPr>
-              <w:t xml:space="preserve">Full demo path works on the live site: submit on a phone → classified → agent switches tone, edits and sends → staff member sees reply; bugs logged in Jira and fixed</w:t>
+            <w:shd w:fill="F0EFEC" w:color="auto" w:val="clear"/>
+            <w:tcMar>
+              <w:top w:type="dxa" w:w="70"/>
+              <w:left w:type="dxa" w:w="110"/>
+              <w:bottom w:type="dxa" w:w="70"/>
+              <w:right w:type="dxa" w:w="110"/>
+            </w:tcMar>
+            <w:vAlign w:val="top"/>
+          </w:tcPr>
+          <w:p>
+            <w:r>
+              <w:rPr>
+                <w:rFonts w:ascii="Calibri" w:cs="Calibri" w:eastAsia="Calibri" w:hAnsi="Calibri"/>
+                <w:b w:val="false"/>
+                <w:bCs w:val="false"/>
+                <w:sz w:val="19"/>
+                <w:szCs w:val="19"/>
+              </w:rPr>
+              <w:t xml:space="preserve">Tickets below 0.6 confidence marked "Needs review"; agent can change the department; every change saved with who made it and when</w:t>
             </w:r>
           </w:p>
         </w:tc>
@@ -5867,6 +5573,7 @@
               <w:bottom w:val="single" w:color="BFBFBF" w:sz="4"/>
               <w:right w:val="single" w:color="BFBFBF" w:sz="4"/>
             </w:tcBorders>
+            <w:shd w:fill="F0EFEC" w:color="auto" w:val="clear"/>
             <w:tcMar>
               <w:top w:type="dxa" w:w="70"/>
               <w:left w:type="dxa" w:w="110"/>
@@ -5895,6 +5602,429 @@
         </w:trPr>
         <w:tc>
           <w:tcPr>
+            <w:vMerge w:val="continue"/>
+            <w:tcBorders>
+              <w:top w:val="single" w:color="BFBFBF" w:sz="4"/>
+              <w:left w:val="single" w:color="BFBFBF" w:sz="4"/>
+              <w:bottom w:val="single" w:color="BFBFBF" w:sz="4"/>
+              <w:right w:val="single" w:color="BFBFBF" w:sz="4"/>
+            </w:tcBorders>
+          </w:tcPr>
+          <w:p/>
+        </w:tc>
+        <w:tc>
+          <w:tcPr>
+            <w:tcW w:type="dxa" w:w="1700"/>
+            <w:tcBorders>
+              <w:top w:val="single" w:color="BFBFBF" w:sz="4"/>
+              <w:left w:val="single" w:color="BFBFBF" w:sz="4"/>
+              <w:bottom w:val="single" w:color="BFBFBF" w:sz="4"/>
+              <w:right w:val="single" w:color="BFBFBF" w:sz="4"/>
+            </w:tcBorders>
+            <w:shd w:fill="F0EFEC" w:color="auto" w:val="clear"/>
+            <w:tcMar>
+              <w:top w:type="dxa" w:w="70"/>
+              <w:left w:type="dxa" w:w="110"/>
+              <w:bottom w:type="dxa" w:w="70"/>
+              <w:right w:type="dxa" w:w="110"/>
+            </w:tcMar>
+            <w:vAlign w:val="top"/>
+          </w:tcPr>
+          <w:p>
+            <w:r>
+              <w:rPr>
+                <w:rFonts w:ascii="Calibri" w:cs="Calibri" w:eastAsia="Calibri" w:hAnsi="Calibri"/>
+                <w:b/>
+                <w:bCs/>
+                <w:sz w:val="19"/>
+                <w:szCs w:val="19"/>
+              </w:rPr>
+              <w:t xml:space="preserve">Mihlali</w:t>
+            </w:r>
+          </w:p>
+        </w:tc>
+        <w:tc>
+          <w:tcPr>
+            <w:tcW w:type="dxa" w:w="5000"/>
+            <w:tcBorders>
+              <w:top w:val="single" w:color="BFBFBF" w:sz="4"/>
+              <w:left w:val="single" w:color="BFBFBF" w:sz="4"/>
+              <w:bottom w:val="single" w:color="BFBFBF" w:sz="4"/>
+              <w:right w:val="single" w:color="BFBFBF" w:sz="4"/>
+            </w:tcBorders>
+            <w:shd w:fill="F0EFEC" w:color="auto" w:val="clear"/>
+            <w:tcMar>
+              <w:top w:type="dxa" w:w="70"/>
+              <w:left w:type="dxa" w:w="110"/>
+              <w:bottom w:type="dxa" w:w="70"/>
+              <w:right w:type="dxa" w:w="110"/>
+            </w:tcMar>
+            <w:vAlign w:val="top"/>
+          </w:tcPr>
+          <w:p>
+            <w:r>
+              <w:rPr>
+                <w:rFonts w:ascii="Calibri" w:cs="Calibri" w:eastAsia="Calibri" w:hAnsi="Calibri"/>
+                <w:b w:val="false"/>
+                <w:bCs w:val="false"/>
+                <w:sz w:val="19"/>
+                <w:szCs w:val="19"/>
+              </w:rPr>
+              <w:t xml:space="preserve">S1-26 · As a staff member, I want to see my requests and their status, so that I don't have to chase anyone on WhatsApp.</w:t>
+            </w:r>
+          </w:p>
+        </w:tc>
+        <w:tc>
+          <w:tcPr>
+            <w:tcW w:type="dxa" w:w="5078"/>
+            <w:tcBorders>
+              <w:top w:val="single" w:color="BFBFBF" w:sz="4"/>
+              <w:left w:val="single" w:color="BFBFBF" w:sz="4"/>
+              <w:bottom w:val="single" w:color="BFBFBF" w:sz="4"/>
+              <w:right w:val="single" w:color="BFBFBF" w:sz="4"/>
+            </w:tcBorders>
+            <w:shd w:fill="F0EFEC" w:color="auto" w:val="clear"/>
+            <w:tcMar>
+              <w:top w:type="dxa" w:w="70"/>
+              <w:left w:type="dxa" w:w="110"/>
+              <w:bottom w:type="dxa" w:w="70"/>
+              <w:right w:type="dxa" w:w="110"/>
+            </w:tcMar>
+            <w:vAlign w:val="top"/>
+          </w:tcPr>
+          <w:p>
+            <w:r>
+              <w:rPr>
+                <w:rFonts w:ascii="Calibri" w:cs="Calibri" w:eastAsia="Calibri" w:hAnsi="Calibri"/>
+                <w:b w:val="false"/>
+                <w:bCs w:val="false"/>
+                <w:sz w:val="19"/>
+                <w:szCs w:val="19"/>
+              </w:rPr>
+              <w:t xml:space="preserve">My requests list, newest first; status shown in words and colour; detail page shows department, status history and the reply once sent</w:t>
+            </w:r>
+          </w:p>
+        </w:tc>
+        <w:tc>
+          <w:tcPr>
+            <w:tcW w:type="dxa" w:w="1400"/>
+            <w:tcBorders>
+              <w:top w:val="single" w:color="BFBFBF" w:sz="4"/>
+              <w:left w:val="single" w:color="BFBFBF" w:sz="4"/>
+              <w:bottom w:val="single" w:color="BFBFBF" w:sz="4"/>
+              <w:right w:val="single" w:color="BFBFBF" w:sz="4"/>
+            </w:tcBorders>
+            <w:shd w:fill="F0EFEC" w:color="auto" w:val="clear"/>
+            <w:tcMar>
+              <w:top w:type="dxa" w:w="70"/>
+              <w:left w:type="dxa" w:w="110"/>
+              <w:bottom w:type="dxa" w:w="70"/>
+              <w:right w:type="dxa" w:w="110"/>
+            </w:tcMar>
+            <w:vAlign w:val="top"/>
+          </w:tcPr>
+          <w:p>
+            <w:r>
+              <w:rPr>
+                <w:rFonts w:ascii="Calibri" w:cs="Calibri" w:eastAsia="Calibri" w:hAnsi="Calibri"/>
+                <w:b w:val="false"/>
+                <w:bCs w:val="false"/>
+                <w:sz w:val="19"/>
+                <w:szCs w:val="19"/>
+              </w:rPr>
+              <w:t xml:space="preserve">Not started</w:t>
+            </w:r>
+          </w:p>
+        </w:tc>
+      </w:tr>
+      <w:tr>
+        <w:trPr>
+          <w:cantSplit/>
+        </w:trPr>
+        <w:tc>
+          <w:tcPr>
+            <w:vMerge w:val="continue"/>
+            <w:tcBorders>
+              <w:top w:val="single" w:color="BFBFBF" w:sz="4"/>
+              <w:left w:val="single" w:color="BFBFBF" w:sz="4"/>
+              <w:bottom w:val="single" w:color="BFBFBF" w:sz="4"/>
+              <w:right w:val="single" w:color="BFBFBF" w:sz="4"/>
+            </w:tcBorders>
+          </w:tcPr>
+          <w:p/>
+        </w:tc>
+        <w:tc>
+          <w:tcPr>
+            <w:tcW w:type="dxa" w:w="1700"/>
+            <w:tcBorders>
+              <w:top w:val="single" w:color="BFBFBF" w:sz="4"/>
+              <w:left w:val="single" w:color="BFBFBF" w:sz="4"/>
+              <w:bottom w:val="single" w:color="BFBFBF" w:sz="4"/>
+              <w:right w:val="single" w:color="BFBFBF" w:sz="4"/>
+            </w:tcBorders>
+            <w:shd w:fill="F0EFEC" w:color="auto" w:val="clear"/>
+            <w:tcMar>
+              <w:top w:type="dxa" w:w="70"/>
+              <w:left w:type="dxa" w:w="110"/>
+              <w:bottom w:type="dxa" w:w="70"/>
+              <w:right w:type="dxa" w:w="110"/>
+            </w:tcMar>
+            <w:vAlign w:val="top"/>
+          </w:tcPr>
+          <w:p>
+            <w:r>
+              <w:rPr>
+                <w:rFonts w:ascii="Calibri" w:cs="Calibri" w:eastAsia="Calibri" w:hAnsi="Calibri"/>
+                <w:b/>
+                <w:bCs/>
+                <w:sz w:val="19"/>
+                <w:szCs w:val="19"/>
+              </w:rPr>
+              <w:t xml:space="preserve">Baphakamise</w:t>
+            </w:r>
+          </w:p>
+        </w:tc>
+        <w:tc>
+          <w:tcPr>
+            <w:tcW w:type="dxa" w:w="5000"/>
+            <w:tcBorders>
+              <w:top w:val="single" w:color="BFBFBF" w:sz="4"/>
+              <w:left w:val="single" w:color="BFBFBF" w:sz="4"/>
+              <w:bottom w:val="single" w:color="BFBFBF" w:sz="4"/>
+              <w:right w:val="single" w:color="BFBFBF" w:sz="4"/>
+            </w:tcBorders>
+            <w:shd w:fill="F0EFEC" w:color="auto" w:val="clear"/>
+            <w:tcMar>
+              <w:top w:type="dxa" w:w="70"/>
+              <w:left w:type="dxa" w:w="110"/>
+              <w:bottom w:type="dxa" w:w="70"/>
+              <w:right w:type="dxa" w:w="110"/>
+            </w:tcMar>
+            <w:vAlign w:val="top"/>
+          </w:tcPr>
+          <w:p>
+            <w:r>
+              <w:rPr>
+                <w:rFonts w:ascii="Calibri" w:cs="Calibri" w:eastAsia="Calibri" w:hAnsi="Calibri"/>
+                <w:b w:val="false"/>
+                <w:bCs w:val="false"/>
+                <w:sz w:val="19"/>
+                <w:szCs w:val="19"/>
+              </w:rPr>
+              <w:t xml:space="preserve">S1-27 · As an agent, I want a template library screen, so that I can view and update the reply templates.</w:t>
+            </w:r>
+          </w:p>
+        </w:tc>
+        <w:tc>
+          <w:tcPr>
+            <w:tcW w:type="dxa" w:w="5078"/>
+            <w:tcBorders>
+              <w:top w:val="single" w:color="BFBFBF" w:sz="4"/>
+              <w:left w:val="single" w:color="BFBFBF" w:sz="4"/>
+              <w:bottom w:val="single" w:color="BFBFBF" w:sz="4"/>
+              <w:right w:val="single" w:color="BFBFBF" w:sz="4"/>
+            </w:tcBorders>
+            <w:shd w:fill="F0EFEC" w:color="auto" w:val="clear"/>
+            <w:tcMar>
+              <w:top w:type="dxa" w:w="70"/>
+              <w:left w:type="dxa" w:w="110"/>
+              <w:bottom w:type="dxa" w:w="70"/>
+              <w:right w:type="dxa" w:w="110"/>
+            </w:tcMar>
+            <w:vAlign w:val="top"/>
+          </w:tcPr>
+          <w:p>
+            <w:r>
+              <w:rPr>
+                <w:rFonts w:ascii="Calibri" w:cs="Calibri" w:eastAsia="Calibri" w:hAnsi="Calibri"/>
+                <w:b w:val="false"/>
+                <w:bCs w:val="false"/>
+                <w:sz w:val="19"/>
+                <w:szCs w:val="19"/>
+              </w:rPr>
+              <w:t xml:space="preserve">Screen lists templates by department; agent can edit a template; changes saved</w:t>
+            </w:r>
+          </w:p>
+        </w:tc>
+        <w:tc>
+          <w:tcPr>
+            <w:tcW w:type="dxa" w:w="1400"/>
+            <w:tcBorders>
+              <w:top w:val="single" w:color="BFBFBF" w:sz="4"/>
+              <w:left w:val="single" w:color="BFBFBF" w:sz="4"/>
+              <w:bottom w:val="single" w:color="BFBFBF" w:sz="4"/>
+              <w:right w:val="single" w:color="BFBFBF" w:sz="4"/>
+            </w:tcBorders>
+            <w:shd w:fill="F0EFEC" w:color="auto" w:val="clear"/>
+            <w:tcMar>
+              <w:top w:type="dxa" w:w="70"/>
+              <w:left w:type="dxa" w:w="110"/>
+              <w:bottom w:type="dxa" w:w="70"/>
+              <w:right w:type="dxa" w:w="110"/>
+            </w:tcMar>
+            <w:vAlign w:val="top"/>
+          </w:tcPr>
+          <w:p>
+            <w:r>
+              <w:rPr>
+                <w:rFonts w:ascii="Calibri" w:cs="Calibri" w:eastAsia="Calibri" w:hAnsi="Calibri"/>
+                <w:b w:val="false"/>
+                <w:bCs w:val="false"/>
+                <w:sz w:val="19"/>
+                <w:szCs w:val="19"/>
+              </w:rPr>
+              <w:t xml:space="preserve">Not started</w:t>
+            </w:r>
+          </w:p>
+        </w:tc>
+      </w:tr>
+      <w:tr>
+        <w:trPr>
+          <w:cantSplit/>
+        </w:trPr>
+        <w:tc>
+          <w:tcPr>
+            <w:vMerge w:val="continue"/>
+            <w:tcBorders>
+              <w:top w:val="single" w:color="BFBFBF" w:sz="4"/>
+              <w:left w:val="single" w:color="BFBFBF" w:sz="4"/>
+              <w:bottom w:val="single" w:color="BFBFBF" w:sz="4"/>
+              <w:right w:val="single" w:color="BFBFBF" w:sz="4"/>
+            </w:tcBorders>
+          </w:tcPr>
+          <w:p/>
+        </w:tc>
+        <w:tc>
+          <w:tcPr>
+            <w:tcW w:type="dxa" w:w="1700"/>
+            <w:tcBorders>
+              <w:top w:val="single" w:color="BFBFBF" w:sz="4"/>
+              <w:left w:val="single" w:color="BFBFBF" w:sz="4"/>
+              <w:bottom w:val="single" w:color="BFBFBF" w:sz="4"/>
+              <w:right w:val="single" w:color="BFBFBF" w:sz="4"/>
+            </w:tcBorders>
+            <w:shd w:fill="F0EFEC" w:color="auto" w:val="clear"/>
+            <w:tcMar>
+              <w:top w:type="dxa" w:w="70"/>
+              <w:left w:type="dxa" w:w="110"/>
+              <w:bottom w:type="dxa" w:w="70"/>
+              <w:right w:type="dxa" w:w="110"/>
+            </w:tcMar>
+            <w:vAlign w:val="top"/>
+          </w:tcPr>
+          <w:p>
+            <w:r>
+              <w:rPr>
+                <w:rFonts w:ascii="Calibri" w:cs="Calibri" w:eastAsia="Calibri" w:hAnsi="Calibri"/>
+                <w:b/>
+                <w:bCs/>
+                <w:sz w:val="19"/>
+                <w:szCs w:val="19"/>
+              </w:rPr>
+              <w:t xml:space="preserve">Baphakamise</w:t>
+            </w:r>
+          </w:p>
+        </w:tc>
+        <w:tc>
+          <w:tcPr>
+            <w:tcW w:type="dxa" w:w="5000"/>
+            <w:tcBorders>
+              <w:top w:val="single" w:color="BFBFBF" w:sz="4"/>
+              <w:left w:val="single" w:color="BFBFBF" w:sz="4"/>
+              <w:bottom w:val="single" w:color="BFBFBF" w:sz="4"/>
+              <w:right w:val="single" w:color="BFBFBF" w:sz="4"/>
+            </w:tcBorders>
+            <w:shd w:fill="F0EFEC" w:color="auto" w:val="clear"/>
+            <w:tcMar>
+              <w:top w:type="dxa" w:w="70"/>
+              <w:left w:type="dxa" w:w="110"/>
+              <w:bottom w:type="dxa" w:w="70"/>
+              <w:right w:type="dxa" w:w="110"/>
+            </w:tcMar>
+            <w:vAlign w:val="top"/>
+          </w:tcPr>
+          <w:p>
+            <w:r>
+              <w:rPr>
+                <w:rFonts w:ascii="Calibri" w:cs="Calibri" w:eastAsia="Calibri" w:hAnsi="Calibri"/>
+                <w:b w:val="false"/>
+                <w:bCs w:val="false"/>
+                <w:sz w:val="19"/>
+                <w:szCs w:val="19"/>
+              </w:rPr>
+              <w:t xml:space="preserve">S1-28 · As a staff member, I want to see the agent's reply on my request, so that I get my answer in one place.</w:t>
+            </w:r>
+          </w:p>
+        </w:tc>
+        <w:tc>
+          <w:tcPr>
+            <w:tcW w:type="dxa" w:w="5078"/>
+            <w:tcBorders>
+              <w:top w:val="single" w:color="BFBFBF" w:sz="4"/>
+              <w:left w:val="single" w:color="BFBFBF" w:sz="4"/>
+              <w:bottom w:val="single" w:color="BFBFBF" w:sz="4"/>
+              <w:right w:val="single" w:color="BFBFBF" w:sz="4"/>
+            </w:tcBorders>
+            <w:shd w:fill="F0EFEC" w:color="auto" w:val="clear"/>
+            <w:tcMar>
+              <w:top w:type="dxa" w:w="70"/>
+              <w:left w:type="dxa" w:w="110"/>
+              <w:bottom w:type="dxa" w:w="70"/>
+              <w:right w:type="dxa" w:w="110"/>
+            </w:tcMar>
+            <w:vAlign w:val="top"/>
+          </w:tcPr>
+          <w:p>
+            <w:r>
+              <w:rPr>
+                <w:rFonts w:ascii="Calibri" w:cs="Calibri" w:eastAsia="Calibri" w:hAnsi="Calibri"/>
+                <w:b w:val="false"/>
+                <w:bCs w:val="false"/>
+                <w:sz w:val="19"/>
+                <w:szCs w:val="19"/>
+              </w:rPr>
+              <w:t xml:space="preserve">Sent reply appears on the staff member's request detail page; tested together with Mihlali</w:t>
+            </w:r>
+          </w:p>
+        </w:tc>
+        <w:tc>
+          <w:tcPr>
+            <w:tcW w:type="dxa" w:w="1400"/>
+            <w:tcBorders>
+              <w:top w:val="single" w:color="BFBFBF" w:sz="4"/>
+              <w:left w:val="single" w:color="BFBFBF" w:sz="4"/>
+              <w:bottom w:val="single" w:color="BFBFBF" w:sz="4"/>
+              <w:right w:val="single" w:color="BFBFBF" w:sz="4"/>
+            </w:tcBorders>
+            <w:shd w:fill="F0EFEC" w:color="auto" w:val="clear"/>
+            <w:tcMar>
+              <w:top w:type="dxa" w:w="70"/>
+              <w:left w:type="dxa" w:w="110"/>
+              <w:bottom w:type="dxa" w:w="70"/>
+              <w:right w:type="dxa" w:w="110"/>
+            </w:tcMar>
+            <w:vAlign w:val="top"/>
+          </w:tcPr>
+          <w:p>
+            <w:r>
+              <w:rPr>
+                <w:rFonts w:ascii="Calibri" w:cs="Calibri" w:eastAsia="Calibri" w:hAnsi="Calibri"/>
+                <w:b w:val="false"/>
+                <w:bCs w:val="false"/>
+                <w:sz w:val="19"/>
+                <w:szCs w:val="19"/>
+              </w:rPr>
+              <w:t xml:space="preserve">Not started</w:t>
+            </w:r>
+          </w:p>
+        </w:tc>
+      </w:tr>
+      <w:tr>
+        <w:trPr>
+          <w:cantSplit/>
+        </w:trPr>
+        <w:tc>
+          <w:tcPr>
             <w:tcW w:type="dxa" w:w="1500"/>
             <w:tcBorders>
               <w:top w:val="single" w:color="BFBFBF" w:sz="4"/>
@@ -5902,7 +6032,6 @@
               <w:bottom w:val="single" w:color="BFBFBF" w:sz="4"/>
               <w:right w:val="single" w:color="BFBFBF" w:sz="4"/>
             </w:tcBorders>
-            <w:shd w:fill="F0EFEC" w:color="auto" w:val="clear"/>
             <w:tcMar>
               <w:top w:type="dxa" w:w="70"/>
               <w:left w:type="dxa" w:w="110"/>
@@ -5923,7 +6052,7 @@
                 <w:sz w:val="19"/>
                 <w:szCs w:val="19"/>
               </w:rPr>
-              <w:t xml:space="preserve">Fri 30 Oct</w:t>
+              <w:t xml:space="preserve">Thu 29 Oct</w:t>
             </w:r>
           </w:p>
         </w:tc>
@@ -5936,7 +6065,6 @@
               <w:bottom w:val="single" w:color="BFBFBF" w:sz="4"/>
               <w:right w:val="single" w:color="BFBFBF" w:sz="4"/>
             </w:tcBorders>
-            <w:shd w:fill="F0EFEC" w:color="auto" w:val="clear"/>
             <w:tcMar>
               <w:top w:type="dxa" w:w="70"/>
               <w:left w:type="dxa" w:w="110"/>
@@ -5967,25 +6095,24 @@
               <w:bottom w:val="single" w:color="BFBFBF" w:sz="4"/>
               <w:right w:val="single" w:color="BFBFBF" w:sz="4"/>
             </w:tcBorders>
-            <w:shd w:fill="F0EFEC" w:color="auto" w:val="clear"/>
-            <w:tcMar>
-              <w:top w:type="dxa" w:w="70"/>
-              <w:left w:type="dxa" w:w="110"/>
-              <w:bottom w:type="dxa" w:w="70"/>
-              <w:right w:type="dxa" w:w="110"/>
-            </w:tcMar>
-            <w:vAlign w:val="top"/>
-          </w:tcPr>
-          <w:p>
-            <w:r>
-              <w:rPr>
-                <w:rFonts w:ascii="Calibri" w:cs="Calibri" w:eastAsia="Calibri" w:hAnsi="Calibri"/>
-                <w:b w:val="false"/>
-                <w:bCs w:val="false"/>
-                <w:sz w:val="19"/>
-                <w:szCs w:val="19"/>
-              </w:rPr>
-              <w:t xml:space="preserve">Sprint review and retrospective</w:t>
+            <w:tcMar>
+              <w:top w:type="dxa" w:w="70"/>
+              <w:left w:type="dxa" w:w="110"/>
+              <w:bottom w:type="dxa" w:w="70"/>
+              <w:right w:type="dxa" w:w="110"/>
+            </w:tcMar>
+            <w:vAlign w:val="top"/>
+          </w:tcPr>
+          <w:p>
+            <w:r>
+              <w:rPr>
+                <w:rFonts w:ascii="Calibri" w:cs="Calibri" w:eastAsia="Calibri" w:hAnsi="Calibri"/>
+                <w:b w:val="false"/>
+                <w:bCs w:val="false"/>
+                <w:sz w:val="19"/>
+                <w:szCs w:val="19"/>
+              </w:rPr>
+              <w:t xml:space="preserve">As the team, I want to test the full journey on the live site, so that we know it works before the demo.</w:t>
             </w:r>
           </w:p>
         </w:tc>
@@ -5998,25 +6125,186 @@
               <w:bottom w:val="single" w:color="BFBFBF" w:sz="4"/>
               <w:right w:val="single" w:color="BFBFBF" w:sz="4"/>
             </w:tcBorders>
-            <w:shd w:fill="F0EFEC" w:color="auto" w:val="clear"/>
-            <w:tcMar>
-              <w:top w:type="dxa" w:w="70"/>
-              <w:left w:type="dxa" w:w="110"/>
-              <w:bottom w:type="dxa" w:w="70"/>
-              <w:right w:type="dxa" w:w="110"/>
-            </w:tcMar>
-            <w:vAlign w:val="top"/>
-          </w:tcPr>
-          <w:p>
-            <w:r>
-              <w:rPr>
-                <w:rFonts w:ascii="Calibri" w:cs="Calibri" w:eastAsia="Calibri" w:hAnsi="Calibri"/>
-                <w:b w:val="false"/>
-                <w:bCs w:val="false"/>
-                <w:sz w:val="19"/>
-                <w:szCs w:val="19"/>
-              </w:rPr>
-              <w:t xml:space="preserve">Demo rehearsed and presented; Jira stories updated; retro note (what went well, what to change) saved in docs/sprints</w:t>
+            <w:tcMar>
+              <w:top w:type="dxa" w:w="70"/>
+              <w:left w:type="dxa" w:w="110"/>
+              <w:bottom w:type="dxa" w:w="70"/>
+              <w:right w:type="dxa" w:w="110"/>
+            </w:tcMar>
+            <w:vAlign w:val="top"/>
+          </w:tcPr>
+          <w:p>
+            <w:r>
+              <w:rPr>
+                <w:rFonts w:ascii="Calibri" w:cs="Calibri" w:eastAsia="Calibri" w:hAnsi="Calibri"/>
+                <w:b w:val="false"/>
+                <w:bCs w:val="false"/>
+                <w:sz w:val="19"/>
+                <w:szCs w:val="19"/>
+              </w:rPr>
+              <w:t xml:space="preserve">Submit on a phone → classified → agent switches tone, edits and sends → staff member sees the reply; bugs logged in Jira and fixed</w:t>
+            </w:r>
+          </w:p>
+        </w:tc>
+        <w:tc>
+          <w:tcPr>
+            <w:tcW w:type="dxa" w:w="1400"/>
+            <w:tcBorders>
+              <w:top w:val="single" w:color="BFBFBF" w:sz="4"/>
+              <w:left w:val="single" w:color="BFBFBF" w:sz="4"/>
+              <w:bottom w:val="single" w:color="BFBFBF" w:sz="4"/>
+              <w:right w:val="single" w:color="BFBFBF" w:sz="4"/>
+            </w:tcBorders>
+            <w:tcMar>
+              <w:top w:type="dxa" w:w="70"/>
+              <w:left w:type="dxa" w:w="110"/>
+              <w:bottom w:type="dxa" w:w="70"/>
+              <w:right w:type="dxa" w:w="110"/>
+            </w:tcMar>
+            <w:vAlign w:val="top"/>
+          </w:tcPr>
+          <w:p>
+            <w:r>
+              <w:rPr>
+                <w:rFonts w:ascii="Calibri" w:cs="Calibri" w:eastAsia="Calibri" w:hAnsi="Calibri"/>
+                <w:b w:val="false"/>
+                <w:bCs w:val="false"/>
+                <w:sz w:val="19"/>
+                <w:szCs w:val="19"/>
+              </w:rPr>
+              <w:t xml:space="preserve">Not started</w:t>
+            </w:r>
+          </w:p>
+        </w:tc>
+      </w:tr>
+      <w:tr>
+        <w:trPr>
+          <w:cantSplit/>
+        </w:trPr>
+        <w:tc>
+          <w:tcPr>
+            <w:tcW w:type="dxa" w:w="1500"/>
+            <w:tcBorders>
+              <w:top w:val="single" w:color="BFBFBF" w:sz="4"/>
+              <w:left w:val="single" w:color="BFBFBF" w:sz="4"/>
+              <w:bottom w:val="single" w:color="BFBFBF" w:sz="4"/>
+              <w:right w:val="single" w:color="BFBFBF" w:sz="4"/>
+            </w:tcBorders>
+            <w:shd w:fill="F0EFEC" w:color="auto" w:val="clear"/>
+            <w:tcMar>
+              <w:top w:type="dxa" w:w="70"/>
+              <w:left w:type="dxa" w:w="110"/>
+              <w:bottom w:type="dxa" w:w="70"/>
+              <w:right w:type="dxa" w:w="110"/>
+            </w:tcMar>
+            <w:vAlign w:val="center"/>
+          </w:tcPr>
+          <w:p>
+            <w:pPr>
+              <w:jc w:val="center"/>
+            </w:pPr>
+            <w:r>
+              <w:rPr>
+                <w:rFonts w:ascii="Calibri" w:cs="Calibri" w:eastAsia="Calibri" w:hAnsi="Calibri"/>
+                <w:b/>
+                <w:bCs/>
+                <w:sz w:val="19"/>
+                <w:szCs w:val="19"/>
+              </w:rPr>
+              <w:t xml:space="preserve">Fri 30 Oct</w:t>
+            </w:r>
+          </w:p>
+        </w:tc>
+        <w:tc>
+          <w:tcPr>
+            <w:tcW w:type="dxa" w:w="1700"/>
+            <w:tcBorders>
+              <w:top w:val="single" w:color="BFBFBF" w:sz="4"/>
+              <w:left w:val="single" w:color="BFBFBF" w:sz="4"/>
+              <w:bottom w:val="single" w:color="BFBFBF" w:sz="4"/>
+              <w:right w:val="single" w:color="BFBFBF" w:sz="4"/>
+            </w:tcBorders>
+            <w:shd w:fill="F0EFEC" w:color="auto" w:val="clear"/>
+            <w:tcMar>
+              <w:top w:type="dxa" w:w="70"/>
+              <w:left w:type="dxa" w:w="110"/>
+              <w:bottom w:type="dxa" w:w="70"/>
+              <w:right w:type="dxa" w:w="110"/>
+            </w:tcMar>
+            <w:vAlign w:val="top"/>
+          </w:tcPr>
+          <w:p>
+            <w:r>
+              <w:rPr>
+                <w:rFonts w:ascii="Calibri" w:cs="Calibri" w:eastAsia="Calibri" w:hAnsi="Calibri"/>
+                <w:b/>
+                <w:bCs/>
+                <w:sz w:val="19"/>
+                <w:szCs w:val="19"/>
+              </w:rPr>
+              <w:t xml:space="preserve">All members</w:t>
+            </w:r>
+          </w:p>
+        </w:tc>
+        <w:tc>
+          <w:tcPr>
+            <w:tcW w:type="dxa" w:w="5000"/>
+            <w:tcBorders>
+              <w:top w:val="single" w:color="BFBFBF" w:sz="4"/>
+              <w:left w:val="single" w:color="BFBFBF" w:sz="4"/>
+              <w:bottom w:val="single" w:color="BFBFBF" w:sz="4"/>
+              <w:right w:val="single" w:color="BFBFBF" w:sz="4"/>
+            </w:tcBorders>
+            <w:shd w:fill="F0EFEC" w:color="auto" w:val="clear"/>
+            <w:tcMar>
+              <w:top w:type="dxa" w:w="70"/>
+              <w:left w:type="dxa" w:w="110"/>
+              <w:bottom w:type="dxa" w:w="70"/>
+              <w:right w:type="dxa" w:w="110"/>
+            </w:tcMar>
+            <w:vAlign w:val="top"/>
+          </w:tcPr>
+          <w:p>
+            <w:r>
+              <w:rPr>
+                <w:rFonts w:ascii="Calibri" w:cs="Calibri" w:eastAsia="Calibri" w:hAnsi="Calibri"/>
+                <w:b w:val="false"/>
+                <w:bCs w:val="false"/>
+                <w:sz w:val="19"/>
+                <w:szCs w:val="19"/>
+              </w:rPr>
+              <w:t xml:space="preserve">As the team, I want to demo our work and reflect on the sprint, so that we get feedback and improve in Sprint 2.</w:t>
+            </w:r>
+          </w:p>
+        </w:tc>
+        <w:tc>
+          <w:tcPr>
+            <w:tcW w:type="dxa" w:w="5078"/>
+            <w:tcBorders>
+              <w:top w:val="single" w:color="BFBFBF" w:sz="4"/>
+              <w:left w:val="single" w:color="BFBFBF" w:sz="4"/>
+              <w:bottom w:val="single" w:color="BFBFBF" w:sz="4"/>
+              <w:right w:val="single" w:color="BFBFBF" w:sz="4"/>
+            </w:tcBorders>
+            <w:shd w:fill="F0EFEC" w:color="auto" w:val="clear"/>
+            <w:tcMar>
+              <w:top w:type="dxa" w:w="70"/>
+              <w:left w:type="dxa" w:w="110"/>
+              <w:bottom w:type="dxa" w:w="70"/>
+              <w:right w:type="dxa" w:w="110"/>
+            </w:tcMar>
+            <w:vAlign w:val="top"/>
+          </w:tcPr>
+          <w:p>
+            <w:r>
+              <w:rPr>
+                <w:rFonts w:ascii="Calibri" w:cs="Calibri" w:eastAsia="Calibri" w:hAnsi="Calibri"/>
+                <w:b w:val="false"/>
+                <w:bCs w:val="false"/>
+                <w:sz w:val="19"/>
+                <w:szCs w:val="19"/>
+              </w:rPr>
+              <w:t xml:space="preserve">Demo presented at the sprint review; Jira stories updated; retro note (what went well, what to change) saved in docs/sprints</w:t>
             </w:r>
           </w:p>
         </w:tc>

</xml_diff>

<commit_message>
Sprint 1 plan: Mon and Tue as planning days
Co-Authored-By: Claude Opus 5.5 <noreply@anthropic.com>
Claude-Session: https://claude.ai/code/session_014Xczj9BvceXEqxvt3pSPtj
</commit_message>
<xml_diff>
--- a/docs/sprints/Sprint1_Plan.docx
+++ b/docs/sprints/Sprint1_Plan.docx
@@ -1740,170 +1740,31 @@
         </w:tc>
         <w:tc>
           <w:tcPr>
-            <w:tcW w:type="dxa" w:w="4500"/>
-            <w:tcBorders>
-              <w:top w:val="single" w:color="BFBFBF" w:sz="4"/>
-              <w:left w:val="single" w:color="BFBFBF" w:sz="4"/>
-              <w:bottom w:val="single" w:color="BFBFBF" w:sz="4"/>
-              <w:right w:val="single" w:color="BFBFBF" w:sz="4"/>
-            </w:tcBorders>
-            <w:tcMar>
-              <w:top w:type="dxa" w:w="70"/>
-              <w:left w:type="dxa" w:w="110"/>
-              <w:bottom w:type="dxa" w:w="70"/>
-              <w:right w:type="dxa" w:w="110"/>
-            </w:tcMar>
-            <w:vAlign w:val="top"/>
-          </w:tcPr>
-          <w:p>
-            <w:r>
-              <w:rPr>
-                <w:rFonts w:ascii="Calibri" w:cs="Calibri" w:eastAsia="Calibri" w:hAnsi="Calibri"/>
-                <w:b w:val="false"/>
-                <w:bCs w:val="false"/>
-                <w:sz w:val="19"/>
-                <w:szCs w:val="19"/>
-              </w:rPr>
-              <w:t xml:space="preserve">As the team, I want an agreed project idea and roadmap, so that everyone works towards the same product.</w:t>
-            </w:r>
-          </w:p>
-        </w:tc>
-        <w:tc>
-          <w:tcPr>
-            <w:tcW w:type="dxa" w:w="5978"/>
-            <w:tcBorders>
-              <w:top w:val="single" w:color="BFBFBF" w:sz="4"/>
-              <w:left w:val="single" w:color="BFBFBF" w:sz="4"/>
-              <w:bottom w:val="single" w:color="BFBFBF" w:sz="4"/>
-              <w:right w:val="single" w:color="BFBFBF" w:sz="4"/>
-            </w:tcBorders>
-            <w:tcMar>
-              <w:top w:type="dxa" w:w="70"/>
-              <w:left w:type="dxa" w:w="110"/>
-              <w:bottom w:type="dxa" w:w="70"/>
-              <w:right w:type="dxa" w:w="110"/>
-            </w:tcMar>
-          </w:tcPr>
-          <w:p>
-            <w:pPr>
-              <w:spacing w:after="0"/>
-            </w:pPr>
-            <w:r>
-              <w:rPr>
-                <w:rFonts w:ascii="Calibri" w:cs="Calibri" w:eastAsia="Calibri" w:hAnsi="Calibri"/>
-                <w:b/>
-                <w:bCs/>
-                <w:color w:val="1F3A5F"/>
-                <w:sz w:val="19"/>
-                <w:szCs w:val="19"/>
-              </w:rPr>
-              <w:t xml:space="preserve">Given</w:t>
-            </w:r>
-            <w:r>
-              <w:rPr>
-                <w:rFonts w:ascii="Calibri" w:cs="Calibri" w:eastAsia="Calibri" w:hAnsi="Calibri"/>
-                <w:sz w:val="19"/>
-                <w:szCs w:val="19"/>
-              </w:rPr>
-              <w:t xml:space="preserve"> the CAPACITI curriculum</w:t>
-            </w:r>
-          </w:p>
-          <w:p>
-            <w:pPr>
-              <w:spacing w:after="0"/>
-            </w:pPr>
-            <w:r>
-              <w:rPr>
-                <w:rFonts w:ascii="Calibri" w:cs="Calibri" w:eastAsia="Calibri" w:hAnsi="Calibri"/>
-                <w:b/>
-                <w:bCs/>
-                <w:color w:val="1F3A5F"/>
-                <w:sz w:val="19"/>
-                <w:szCs w:val="19"/>
-              </w:rPr>
-              <w:t xml:space="preserve">When</w:t>
-            </w:r>
-            <w:r>
-              <w:rPr>
-                <w:rFonts w:ascii="Calibri" w:cs="Calibri" w:eastAsia="Calibri" w:hAnsi="Calibri"/>
-                <w:sz w:val="19"/>
-                <w:szCs w:val="19"/>
-              </w:rPr>
-              <w:t xml:space="preserve"> the team finishes planning</w:t>
-            </w:r>
-          </w:p>
-          <w:p>
-            <w:pPr>
-              <w:spacing w:after="0"/>
-            </w:pPr>
-            <w:r>
-              <w:rPr>
-                <w:rFonts w:ascii="Calibri" w:cs="Calibri" w:eastAsia="Calibri" w:hAnsi="Calibri"/>
-                <w:b/>
-                <w:bCs/>
-                <w:color w:val="1F3A5F"/>
-                <w:sz w:val="19"/>
-                <w:szCs w:val="19"/>
-              </w:rPr>
-              <w:t xml:space="preserve">Then</w:t>
-            </w:r>
-            <w:r>
-              <w:rPr>
-                <w:rFonts w:ascii="Calibri" w:cs="Calibri" w:eastAsia="Calibri" w:hAnsi="Calibri"/>
-                <w:sz w:val="19"/>
-                <w:szCs w:val="19"/>
-              </w:rPr>
-              <w:t xml:space="preserve"> the Relay idea for Kopano Freight is agreed</w:t>
-            </w:r>
-          </w:p>
-          <w:p>
-            <w:pPr>
-              <w:spacing w:after="0"/>
-              <w:ind w:left="200"/>
-            </w:pPr>
-            <w:r>
-              <w:rPr>
-                <w:rFonts w:ascii="Calibri" w:cs="Calibri" w:eastAsia="Calibri" w:hAnsi="Calibri"/>
-                <w:b/>
-                <w:bCs/>
-                <w:color w:val="1F3A5F"/>
-                <w:sz w:val="19"/>
-                <w:szCs w:val="19"/>
-              </w:rPr>
-              <w:t xml:space="preserve">And</w:t>
-            </w:r>
-            <w:r>
-              <w:rPr>
-                <w:rFonts w:ascii="Calibri" w:cs="Calibri" w:eastAsia="Calibri" w:hAnsi="Calibri"/>
-                <w:sz w:val="19"/>
-                <w:szCs w:val="19"/>
-              </w:rPr>
-              <w:t xml:space="preserve"> the 8-week roadmap is written</w:t>
-            </w:r>
-          </w:p>
-          <w:p>
-            <w:pPr>
-              <w:spacing w:after="0"/>
-              <w:ind w:left="200"/>
-            </w:pPr>
-            <w:r>
-              <w:rPr>
-                <w:rFonts w:ascii="Calibri" w:cs="Calibri" w:eastAsia="Calibri" w:hAnsi="Calibri"/>
-                <w:b/>
-                <w:bCs/>
-                <w:color w:val="1F3A5F"/>
-                <w:sz w:val="19"/>
-                <w:szCs w:val="19"/>
-              </w:rPr>
-              <w:t xml:space="preserve">And</w:t>
-            </w:r>
-            <w:r>
-              <w:rPr>
-                <w:rFonts w:ascii="Calibri" w:cs="Calibri" w:eastAsia="Calibri" w:hAnsi="Calibri"/>
-                <w:sz w:val="19"/>
-                <w:szCs w:val="19"/>
-              </w:rPr>
-              <w:t xml:space="preserve"> the Jira epics are created with dates</w:t>
+            <w:tcW w:type="dxa" w:w="10478"/>
+            <w:gridSpan w:val="2"/>
+            <w:tcBorders>
+              <w:top w:val="single" w:color="BFBFBF" w:sz="4"/>
+              <w:left w:val="single" w:color="BFBFBF" w:sz="4"/>
+              <w:bottom w:val="single" w:color="BFBFBF" w:sz="4"/>
+              <w:right w:val="single" w:color="BFBFBF" w:sz="4"/>
+            </w:tcBorders>
+            <w:tcMar>
+              <w:top w:type="dxa" w:w="70"/>
+              <w:left w:type="dxa" w:w="110"/>
+              <w:bottom w:type="dxa" w:w="70"/>
+              <w:right w:type="dxa" w:w="110"/>
+            </w:tcMar>
+          </w:tcPr>
+          <w:p>
+            <w:r>
+              <w:rPr>
+                <w:rFonts w:ascii="Calibri" w:cs="Calibri" w:eastAsia="Calibri" w:hAnsi="Calibri"/>
+                <w:b/>
+                <w:bCs/>
+                <w:sz w:val="19"/>
+                <w:szCs w:val="19"/>
+              </w:rPr>
+              <w:t xml:space="preserve">Planning</w:t>
             </w:r>
           </w:p>
         </w:tc>
@@ -1928,8 +1789,6 @@
             <w:r>
               <w:rPr>
                 <w:rFonts w:ascii="Calibri" w:cs="Calibri" w:eastAsia="Calibri" w:hAnsi="Calibri"/>
-                <w:b w:val="false"/>
-                <w:bCs w:val="false"/>
                 <w:sz w:val="19"/>
                 <w:szCs w:val="19"/>
               </w:rPr>
@@ -2009,7 +1868,8 @@
         </w:tc>
         <w:tc>
           <w:tcPr>
-            <w:tcW w:type="dxa" w:w="4500"/>
+            <w:tcW w:type="dxa" w:w="10478"/>
+            <w:gridSpan w:val="2"/>
             <w:tcBorders>
               <w:top w:val="single" w:color="BFBFBF" w:sz="4"/>
               <w:left w:val="single" w:color="BFBFBF" w:sz="4"/>
@@ -2023,24 +1883,23 @@
               <w:bottom w:type="dxa" w:w="70"/>
               <w:right w:type="dxa" w:w="110"/>
             </w:tcMar>
-            <w:vAlign w:val="top"/>
-          </w:tcPr>
-          <w:p>
-            <w:r>
-              <w:rPr>
-                <w:rFonts w:ascii="Calibri" w:cs="Calibri" w:eastAsia="Calibri" w:hAnsi="Calibri"/>
-                <w:b w:val="false"/>
-                <w:bCs w:val="false"/>
-                <w:sz w:val="19"/>
-                <w:szCs w:val="19"/>
-              </w:rPr>
-              <w:t xml:space="preserve">As the team, I want the sprint planned and our tools set up, so that everyone knows what to build and where.</w:t>
-            </w:r>
-          </w:p>
-        </w:tc>
-        <w:tc>
-          <w:tcPr>
-            <w:tcW w:type="dxa" w:w="5978"/>
+          </w:tcPr>
+          <w:p>
+            <w:r>
+              <w:rPr>
+                <w:rFonts w:ascii="Calibri" w:cs="Calibri" w:eastAsia="Calibri" w:hAnsi="Calibri"/>
+                <w:b/>
+                <w:bCs/>
+                <w:sz w:val="19"/>
+                <w:szCs w:val="19"/>
+              </w:rPr>
+              <w:t xml:space="preserve">Planning</w:t>
+            </w:r>
+          </w:p>
+        </w:tc>
+        <w:tc>
+          <w:tcPr>
+            <w:tcW w:type="dxa" w:w="1300"/>
             <w:tcBorders>
               <w:top w:val="single" w:color="BFBFBF" w:sz="4"/>
               <w:left w:val="single" w:color="BFBFBF" w:sz="4"/>
@@ -2054,154 +1913,12 @@
               <w:bottom w:type="dxa" w:w="70"/>
               <w:right w:type="dxa" w:w="110"/>
             </w:tcMar>
-          </w:tcPr>
-          <w:p>
-            <w:pPr>
-              <w:spacing w:after="0"/>
-            </w:pPr>
-            <w:r>
-              <w:rPr>
-                <w:rFonts w:ascii="Calibri" w:cs="Calibri" w:eastAsia="Calibri" w:hAnsi="Calibri"/>
-                <w:b/>
-                <w:bCs/>
-                <w:color w:val="1F3A5F"/>
-                <w:sz w:val="19"/>
-                <w:szCs w:val="19"/>
-              </w:rPr>
-              <w:t xml:space="preserve">Given</w:t>
-            </w:r>
-            <w:r>
-              <w:rPr>
-                <w:rFonts w:ascii="Calibri" w:cs="Calibri" w:eastAsia="Calibri" w:hAnsi="Calibri"/>
-                <w:sz w:val="19"/>
-                <w:szCs w:val="19"/>
-              </w:rPr>
-              <w:t xml:space="preserve"> the agreed roadmap</w:t>
-            </w:r>
-          </w:p>
-          <w:p>
-            <w:pPr>
-              <w:spacing w:after="0"/>
-            </w:pPr>
-            <w:r>
-              <w:rPr>
-                <w:rFonts w:ascii="Calibri" w:cs="Calibri" w:eastAsia="Calibri" w:hAnsi="Calibri"/>
-                <w:b/>
-                <w:bCs/>
-                <w:color w:val="1F3A5F"/>
-                <w:sz w:val="19"/>
-                <w:szCs w:val="19"/>
-              </w:rPr>
-              <w:t xml:space="preserve">When</w:t>
-            </w:r>
-            <w:r>
-              <w:rPr>
-                <w:rFonts w:ascii="Calibri" w:cs="Calibri" w:eastAsia="Calibri" w:hAnsi="Calibri"/>
-                <w:sz w:val="19"/>
-                <w:szCs w:val="19"/>
-              </w:rPr>
-              <w:t xml:space="preserve"> sprint planning ends</w:t>
-            </w:r>
-          </w:p>
-          <w:p>
-            <w:pPr>
-              <w:spacing w:after="0"/>
-            </w:pPr>
-            <w:r>
-              <w:rPr>
-                <w:rFonts w:ascii="Calibri" w:cs="Calibri" w:eastAsia="Calibri" w:hAnsi="Calibri"/>
-                <w:b/>
-                <w:bCs/>
-                <w:color w:val="1F3A5F"/>
-                <w:sz w:val="19"/>
-                <w:szCs w:val="19"/>
-              </w:rPr>
-              <w:t xml:space="preserve">Then</w:t>
-            </w:r>
-            <w:r>
-              <w:rPr>
-                <w:rFonts w:ascii="Calibri" w:cs="Calibri" w:eastAsia="Calibri" w:hAnsi="Calibri"/>
-                <w:sz w:val="19"/>
-                <w:szCs w:val="19"/>
-              </w:rPr>
-              <w:t xml:space="preserve"> every Sprint 1 user story has an owner</w:t>
-            </w:r>
-          </w:p>
-          <w:p>
-            <w:pPr>
-              <w:spacing w:after="0"/>
-              <w:ind w:left="200"/>
-            </w:pPr>
-            <w:r>
-              <w:rPr>
-                <w:rFonts w:ascii="Calibri" w:cs="Calibri" w:eastAsia="Calibri" w:hAnsi="Calibri"/>
-                <w:b/>
-                <w:bCs/>
-                <w:color w:val="1F3A5F"/>
-                <w:sz w:val="19"/>
-                <w:szCs w:val="19"/>
-              </w:rPr>
-              <w:t xml:space="preserve">And</w:t>
-            </w:r>
-            <w:r>
-              <w:rPr>
-                <w:rFonts w:ascii="Calibri" w:cs="Calibri" w:eastAsia="Calibri" w:hAnsi="Calibri"/>
-                <w:sz w:val="19"/>
-                <w:szCs w:val="19"/>
-              </w:rPr>
-              <w:t xml:space="preserve"> the GitHub repo exists</w:t>
-            </w:r>
-          </w:p>
-          <w:p>
-            <w:pPr>
-              <w:spacing w:after="0"/>
-              <w:ind w:left="200"/>
-            </w:pPr>
-            <w:r>
-              <w:rPr>
-                <w:rFonts w:ascii="Calibri" w:cs="Calibri" w:eastAsia="Calibri" w:hAnsi="Calibri"/>
-                <w:b/>
-                <w:bCs/>
-                <w:color w:val="1F3A5F"/>
-                <w:sz w:val="19"/>
-                <w:szCs w:val="19"/>
-              </w:rPr>
-              <w:t xml:space="preserve">And</w:t>
-            </w:r>
-            <w:r>
-              <w:rPr>
-                <w:rFonts w:ascii="Calibri" w:cs="Calibri" w:eastAsia="Calibri" w:hAnsi="Calibri"/>
-                <w:sz w:val="19"/>
-                <w:szCs w:val="19"/>
-              </w:rPr>
-              <w:t xml:space="preserve"> the app is live on Vercel</w:t>
-            </w:r>
-          </w:p>
-        </w:tc>
-        <w:tc>
-          <w:tcPr>
-            <w:tcW w:type="dxa" w:w="1300"/>
-            <w:tcBorders>
-              <w:top w:val="single" w:color="BFBFBF" w:sz="4"/>
-              <w:left w:val="single" w:color="BFBFBF" w:sz="4"/>
-              <w:bottom w:val="single" w:color="BFBFBF" w:sz="4"/>
-              <w:right w:val="single" w:color="BFBFBF" w:sz="4"/>
-            </w:tcBorders>
-            <w:shd w:fill="F0EFEC" w:color="auto" w:val="clear"/>
-            <w:tcMar>
-              <w:top w:type="dxa" w:w="70"/>
-              <w:left w:type="dxa" w:w="110"/>
-              <w:bottom w:type="dxa" w:w="70"/>
-              <w:right w:type="dxa" w:w="110"/>
-            </w:tcMar>
-            <w:vAlign w:val="top"/>
-          </w:tcPr>
-          <w:p>
-            <w:r>
-              <w:rPr>
-                <w:rFonts w:ascii="Calibri" w:cs="Calibri" w:eastAsia="Calibri" w:hAnsi="Calibri"/>
-                <w:b w:val="false"/>
-                <w:bCs w:val="false"/>
+            <w:vAlign w:val="top"/>
+          </w:tcPr>
+          <w:p>
+            <w:r>
+              <w:rPr>
+                <w:rFonts w:ascii="Calibri" w:cs="Calibri" w:eastAsia="Calibri" w:hAnsi="Calibri"/>
                 <w:sz w:val="19"/>
                 <w:szCs w:val="19"/>
               </w:rPr>

</xml_diff>

<commit_message>
Remove Jira: track progress in the sprint plan, bugs in GitHub Issues
Co-Authored-By: Claude Opus 5.5 <noreply@anthropic.com>
Claude-Session: https://claude.ai/code/session_014Xczj9BvceXEqxvt3pSPtj
</commit_message>
<xml_diff>
--- a/docs/sprints/Sprint1_Plan.docx
+++ b/docs/sprints/Sprint1_Plan.docx
@@ -10073,7 +10073,7 @@
                 <w:sz w:val="19"/>
                 <w:szCs w:val="19"/>
               </w:rPr>
-              <w:t xml:space="preserve"> every bug found is logged in Jira and fixed</w:t>
+              <w:t xml:space="preserve"> every bug found is logged as a GitHub Issue and fixed</w:t>
             </w:r>
           </w:p>
         </w:tc>
@@ -10319,7 +10319,7 @@
                 <w:sz w:val="19"/>
                 <w:szCs w:val="19"/>
               </w:rPr>
-              <w:t xml:space="preserve"> Jira stories are updated</w:t>
+              <w:t xml:space="preserve"> the Completion column is up to date</w:t>
             </w:r>
           </w:p>
           <w:p>
@@ -10591,7 +10591,7 @@
           <w:sz w:val="21"/>
           <w:szCs w:val="21"/>
         </w:rPr>
-        <w:t xml:space="preserve">a story is done when its acceptance criteria work on the live site, the screens work at phone width, AI output is labelled and editable, data is saved with timestamps, the pull request is reviewed and merged, and the Jira story is moved to Done.</w:t>
+        <w:t xml:space="preserve">a story is done when its acceptance criteria work on the live site, the screens work at phone width, AI output is labelled and editable, data is saved with timestamps, the pull request is reviewed and merged, and the story is marked Done in the Completion column.</w:t>
       </w:r>
     </w:p>
     <w:sectPr>

</xml_diff>

<commit_message>
Restore Jira outside the getting started guide; install steps for Command Prompt
Co-Authored-By: Claude Opus 5.5 <noreply@anthropic.com>
Claude-Session: https://claude.ai/code/session_014Xczj9BvceXEqxvt3pSPtj
</commit_message>
<xml_diff>
--- a/docs/sprints/Sprint1_Plan.docx
+++ b/docs/sprints/Sprint1_Plan.docx
@@ -10073,7 +10073,7 @@
                 <w:sz w:val="19"/>
                 <w:szCs w:val="19"/>
               </w:rPr>
-              <w:t xml:space="preserve"> every bug found is logged as a GitHub Issue and fixed</w:t>
+              <w:t xml:space="preserve"> every bug found is logged in Jira and fixed</w:t>
             </w:r>
           </w:p>
         </w:tc>
@@ -10319,7 +10319,7 @@
                 <w:sz w:val="19"/>
                 <w:szCs w:val="19"/>
               </w:rPr>
-              <w:t xml:space="preserve"> the Completion column is up to date</w:t>
+              <w:t xml:space="preserve"> Jira stories are updated</w:t>
             </w:r>
           </w:p>
           <w:p>
@@ -10591,7 +10591,7 @@
           <w:sz w:val="21"/>
           <w:szCs w:val="21"/>
         </w:rPr>
-        <w:t xml:space="preserve">a story is done when its acceptance criteria work on the live site, the screens work at phone width, AI output is labelled and editable, data is saved with timestamps, the pull request is reviewed and merged, and the story is marked Done in the Completion column.</w:t>
+        <w:t xml:space="preserve">a story is done when its acceptance criteria work on the live site, the screens work at phone width, AI output is labelled and editable, data is saved with timestamps, the pull request is reviewed and merged, and the Jira story is moved to Done.</w:t>
       </w:r>
     </w:p>
     <w:sectPr>

</xml_diff>

<commit_message>
Sprint 1 plan: mark S1-01, S1-05 and S1-09 done
Co-Authored-By: Claude Opus 5.5 <noreply@anthropic.com>
Claude-Session: https://claude.ai/code/session_014Xczj9BvceXEqxvt3pSPtj
</commit_message>
<xml_diff>
--- a/docs/sprints/Sprint1_Plan.docx
+++ b/docs/sprints/Sprint1_Plan.docx
@@ -2237,7 +2237,7 @@
                 <w:sz w:val="19"/>
                 <w:szCs w:val="19"/>
               </w:rPr>
-              <w:t xml:space="preserve">Not started</w:t>
+              <w:t xml:space="preserve">Done (20 Oct)</w:t>
             </w:r>
           </w:p>
         </w:tc>
@@ -3361,7 +3361,7 @@
                 <w:sz w:val="19"/>
                 <w:szCs w:val="19"/>
               </w:rPr>
-              <w:t xml:space="preserve">Not started</w:t>
+              <w:t xml:space="preserve">Done (21 Oct)</w:t>
             </w:r>
           </w:p>
         </w:tc>
@@ -4564,7 +4564,7 @@
                 <w:sz w:val="19"/>
                 <w:szCs w:val="19"/>
               </w:rPr>
-              <w:t xml:space="preserve">Not started</w:t>
+              <w:t xml:space="preserve">Done (21 Oct)</w:t>
             </w:r>
           </w:p>
         </w:tc>

</xml_diff>